<commit_message>
Finished first draft of project design doc
</commit_message>
<xml_diff>
--- a/personal_assignment_submission_1_emr.docx
+++ b/personal_assignment_submission_1_emr.docx
@@ -2,6 +2,626 @@
 <file path=word/document.xml><?xml version="1.0" encoding="utf-8"?>
 <w:document xmlns:wpc="http://schemas.microsoft.com/office/word/2010/wordprocessingCanvas" xmlns:cx="http://schemas.microsoft.com/office/drawing/2014/chartex" xmlns:cx1="http://schemas.microsoft.com/office/drawing/2015/9/8/chartex" xmlns:cx2="http://schemas.microsoft.com/office/drawing/2015/10/21/chartex" xmlns:cx3="http://schemas.microsoft.com/office/drawing/2016/5/9/chartex" xmlns:cx4="http://schemas.microsoft.com/office/drawing/2016/5/10/chartex" xmlns:cx5="http://schemas.microsoft.com/office/drawing/2016/5/11/chartex" xmlns:cx6="http://schemas.microsoft.com/office/drawing/2016/5/12/chartex" xmlns:cx7="http://schemas.microsoft.com/office/drawing/2016/5/13/chartex" xmlns:cx8="http://schemas.microsoft.com/office/drawing/2016/5/14/chartex" xmlns:mc="http://schemas.openxmlformats.org/markup-compatibility/2006" xmlns:aink="http://schemas.microsoft.com/office/drawing/2016/ink" xmlns:am3d="http://schemas.microsoft.com/office/drawing/2017/model3d" xmlns:o="urn:schemas-microsoft-com:office:office" xmlns:oel="http://schemas.microsoft.com/office/2019/extlst" xmlns:r="http://schemas.openxmlformats.org/officeDocument/2006/relationships" xmlns:m="http://schemas.openxmlformats.org/officeDocument/2006/math" xmlns:v="urn:schemas-microsoft-com:vml" xmlns:wp14="http://schemas.microsoft.com/office/word/2010/wordprocessingDrawing" xmlns:wp="http://schemas.openxmlformats.org/drawingml/2006/wordprocessingDrawing" xmlns:w10="urn:schemas-microsoft-com:office:word" xmlns:w="http://schemas.openxmlformats.org/wordprocessingml/2006/main" xmlns:w14="http://schemas.microsoft.com/office/word/2010/wordml" xmlns:w15="http://schemas.microsoft.com/office/word/2012/wordml" xmlns:w16cex="http://schemas.microsoft.com/office/word/2018/wordml/cex" xmlns:w16cid="http://schemas.microsoft.com/office/word/2016/wordml/cid" xmlns:w16="http://schemas.microsoft.com/office/word/2018/wordml" xmlns:w16du="http://schemas.microsoft.com/office/word/2023/wordml/word16du" xmlns:w16sdtdh="http://schemas.microsoft.com/office/word/2020/wordml/sdtdatahash" xmlns:w16sdtfl="http://schemas.microsoft.com/office/word/2024/wordml/sdtformatlock" xmlns:w16se="http://schemas.microsoft.com/office/word/2015/wordml/symex" xmlns:wpg="http://schemas.microsoft.com/office/word/2010/wordprocessingGroup" xmlns:wpi="http://schemas.microsoft.com/office/word/2010/wordprocessingInk" xmlns:wne="http://schemas.microsoft.com/office/word/2006/wordml" xmlns:wps="http://schemas.microsoft.com/office/word/2010/wordprocessingShape" mc:Ignorable="w14 w15 w16se w16cid w16 w16cex w16sdtdh w16sdtfl w16du wp14">
   <w:body>
+    <w:p>
+      <w:pPr>
+        <w:pStyle w:val="Title"/>
+      </w:pPr>
+      <w:r>
+        <w:t>Task Management Web Application</w:t>
+      </w:r>
+    </w:p>
+    <w:p>
+      <w:pPr>
+        <w:pStyle w:val="Subtitle"/>
+      </w:pPr>
+      <w:r>
+        <w:t>Ethan Riegsecker</w:t>
+      </w:r>
+    </w:p>
+    <w:p>
+      <w:pPr>
+        <w:pStyle w:val="Subtitle"/>
+      </w:pPr>
+      <w:r>
+        <w:t>PC &amp; Web Capstone</w:t>
+      </w:r>
+    </w:p>
+    <w:p>
+      <w:pPr>
+        <w:pStyle w:val="Heading1"/>
+      </w:pPr>
+      <w:r>
+        <w:t>Project Description</w:t>
+      </w:r>
+    </w:p>
+    <w:p>
+      <w:r>
+        <w:t xml:space="preserve">This project will provide a way for users to create a reoccurring schedule of tasks. It will provide a way to notify the user when it is time to complete their next task. </w:t>
+      </w:r>
+      <w:r>
+        <w:t>It will primarily be aimed at parents or other users who are building schedules for children or young people. Parents will manage the schedule, but children will also be able to interact with it. This application is meant to encourage children to build accountability when it comes to following a schedule. By allowing both children and their families to participate, children can gain a sense of independence while parents can stay aware of how their children are progressing.</w:t>
+      </w:r>
+    </w:p>
+    <w:p>
+      <w:pPr>
+        <w:pStyle w:val="Heading1"/>
+      </w:pPr>
+      <w:r>
+        <w:t>Target Users</w:t>
+      </w:r>
+    </w:p>
+    <w:tbl>
+      <w:tblPr>
+        <w:tblStyle w:val="GridTable5Dark-Accent1"/>
+        <w:tblW w:w="0" w:type="auto"/>
+        <w:tblLook w:val="0420" w:firstRow="1" w:lastRow="0" w:firstColumn="0" w:lastColumn="0" w:noHBand="0" w:noVBand="1"/>
+      </w:tblPr>
+      <w:tblGrid>
+        <w:gridCol w:w="3116"/>
+        <w:gridCol w:w="3117"/>
+        <w:gridCol w:w="3117"/>
+      </w:tblGrid>
+      <w:tr>
+        <w:trPr>
+          <w:cnfStyle w:val="100000000000" w:firstRow="1" w:lastRow="0" w:firstColumn="0" w:lastColumn="0" w:oddVBand="0" w:evenVBand="0" w:oddHBand="0" w:evenHBand="0" w:firstRowFirstColumn="0" w:firstRowLastColumn="0" w:lastRowFirstColumn="0" w:lastRowLastColumn="0"/>
+        </w:trPr>
+        <w:tc>
+          <w:tcPr>
+            <w:tcW w:w="3116" w:type="dxa"/>
+          </w:tcPr>
+          <w:p>
+            <w:r>
+              <w:rPr>
+                <w:b w:val="0"/>
+                <w:bCs w:val="0"/>
+                <w:color w:val="auto"/>
+              </w:rPr>
+              <w:t>User Role</w:t>
+            </w:r>
+          </w:p>
+        </w:tc>
+        <w:tc>
+          <w:tcPr>
+            <w:tcW w:w="3117" w:type="dxa"/>
+          </w:tcPr>
+          <w:p>
+            <w:pPr>
+              <w:rPr>
+                <w:b w:val="0"/>
+                <w:bCs w:val="0"/>
+                <w:color w:val="auto"/>
+              </w:rPr>
+            </w:pPr>
+            <w:r>
+              <w:rPr>
+                <w:b w:val="0"/>
+                <w:bCs w:val="0"/>
+                <w:color w:val="auto"/>
+              </w:rPr>
+              <w:t>Des</w:t>
+            </w:r>
+            <w:r>
+              <w:rPr>
+                <w:b w:val="0"/>
+                <w:bCs w:val="0"/>
+                <w:color w:val="auto"/>
+              </w:rPr>
+              <w:t>cription</w:t>
+            </w:r>
+          </w:p>
+        </w:tc>
+        <w:tc>
+          <w:tcPr>
+            <w:tcW w:w="3117" w:type="dxa"/>
+          </w:tcPr>
+          <w:p>
+            <w:r>
+              <w:rPr>
+                <w:b w:val="0"/>
+                <w:bCs w:val="0"/>
+                <w:color w:val="auto"/>
+              </w:rPr>
+              <w:t>Possible Permissions</w:t>
+            </w:r>
+          </w:p>
+        </w:tc>
+      </w:tr>
+      <w:tr>
+        <w:trPr>
+          <w:cnfStyle w:val="000000100000" w:firstRow="0" w:lastRow="0" w:firstColumn="0" w:lastColumn="0" w:oddVBand="0" w:evenVBand="0" w:oddHBand="1" w:evenHBand="0" w:firstRowFirstColumn="0" w:firstRowLastColumn="0" w:lastRowFirstColumn="0" w:lastRowLastColumn="0"/>
+        </w:trPr>
+        <w:tc>
+          <w:tcPr>
+            <w:tcW w:w="3116" w:type="dxa"/>
+          </w:tcPr>
+          <w:p>
+            <w:r>
+              <w:t>Admin</w:t>
+            </w:r>
+          </w:p>
+        </w:tc>
+        <w:tc>
+          <w:tcPr>
+            <w:tcW w:w="3117" w:type="dxa"/>
+          </w:tcPr>
+          <w:p>
+            <w:r>
+              <w:t>Manages the application and its users.</w:t>
+            </w:r>
+          </w:p>
+        </w:tc>
+        <w:tc>
+          <w:tcPr>
+            <w:tcW w:w="3117" w:type="dxa"/>
+          </w:tcPr>
+          <w:p>
+            <w:r>
+              <w:t>Add/Edit/Delete Users/Permissions</w:t>
+            </w:r>
+          </w:p>
+          <w:p>
+            <w:r>
+              <w:t>View All Records</w:t>
+            </w:r>
+          </w:p>
+        </w:tc>
+      </w:tr>
+      <w:tr>
+        <w:tc>
+          <w:tcPr>
+            <w:tcW w:w="3116" w:type="dxa"/>
+          </w:tcPr>
+          <w:p>
+            <w:r>
+              <w:t>Parent</w:t>
+            </w:r>
+          </w:p>
+        </w:tc>
+        <w:tc>
+          <w:tcPr>
+            <w:tcW w:w="3117" w:type="dxa"/>
+          </w:tcPr>
+          <w:p>
+            <w:r>
+              <w:t>User who can manage tasks for themselves or for their children</w:t>
+            </w:r>
+          </w:p>
+        </w:tc>
+        <w:tc>
+          <w:tcPr>
+            <w:tcW w:w="3117" w:type="dxa"/>
+          </w:tcPr>
+          <w:p>
+            <w:r>
+              <w:t>Add/Edit/Delete Tasks for themselves or for their children</w:t>
+            </w:r>
+          </w:p>
+          <w:p>
+            <w:r>
+              <w:t>View all records for their children</w:t>
+            </w:r>
+          </w:p>
+        </w:tc>
+      </w:tr>
+      <w:tr>
+        <w:trPr>
+          <w:cnfStyle w:val="000000100000" w:firstRow="0" w:lastRow="0" w:firstColumn="0" w:lastColumn="0" w:oddVBand="0" w:evenVBand="0" w:oddHBand="1" w:evenHBand="0" w:firstRowFirstColumn="0" w:firstRowLastColumn="0" w:lastRowFirstColumn="0" w:lastRowLastColumn="0"/>
+        </w:trPr>
+        <w:tc>
+          <w:tcPr>
+            <w:tcW w:w="3116" w:type="dxa"/>
+          </w:tcPr>
+          <w:p>
+            <w:r>
+              <w:t>Youth</w:t>
+            </w:r>
+          </w:p>
+        </w:tc>
+        <w:tc>
+          <w:tcPr>
+            <w:tcW w:w="3117" w:type="dxa"/>
+          </w:tcPr>
+          <w:p>
+            <w:r>
+              <w:t>User who can see tasks but is restricted</w:t>
+            </w:r>
+          </w:p>
+        </w:tc>
+        <w:tc>
+          <w:tcPr>
+            <w:tcW w:w="3117" w:type="dxa"/>
+          </w:tcPr>
+          <w:p>
+            <w:r>
+              <w:t>Read-only permissions for records specific to them</w:t>
+            </w:r>
+          </w:p>
+        </w:tc>
+      </w:tr>
+    </w:tbl>
+    <w:p/>
+    <w:p>
+      <w:pPr>
+        <w:pStyle w:val="Heading1"/>
+      </w:pPr>
+      <w:r>
+        <w:t>Planned Database Tables</w:t>
+      </w:r>
+    </w:p>
+    <w:tbl>
+      <w:tblPr>
+        <w:tblStyle w:val="GridTable5Dark-Accent1"/>
+        <w:tblW w:w="0" w:type="auto"/>
+        <w:tblLook w:val="0420" w:firstRow="1" w:lastRow="0" w:firstColumn="0" w:lastColumn="0" w:noHBand="0" w:noVBand="1"/>
+      </w:tblPr>
+      <w:tblGrid>
+        <w:gridCol w:w="3116"/>
+        <w:gridCol w:w="3117"/>
+        <w:gridCol w:w="3117"/>
+      </w:tblGrid>
+      <w:tr>
+        <w:trPr>
+          <w:cnfStyle w:val="100000000000" w:firstRow="1" w:lastRow="0" w:firstColumn="0" w:lastColumn="0" w:oddVBand="0" w:evenVBand="0" w:oddHBand="0" w:evenHBand="0" w:firstRowFirstColumn="0" w:firstRowLastColumn="0" w:lastRowFirstColumn="0" w:lastRowLastColumn="0"/>
+        </w:trPr>
+        <w:tc>
+          <w:tcPr>
+            <w:tcW w:w="3116" w:type="dxa"/>
+          </w:tcPr>
+          <w:p>
+            <w:pPr>
+              <w:rPr>
+                <w:b w:val="0"/>
+                <w:bCs w:val="0"/>
+                <w:color w:val="auto"/>
+              </w:rPr>
+            </w:pPr>
+            <w:r>
+              <w:rPr>
+                <w:b w:val="0"/>
+                <w:bCs w:val="0"/>
+                <w:color w:val="auto"/>
+              </w:rPr>
+              <w:t>Table Name</w:t>
+            </w:r>
+          </w:p>
+        </w:tc>
+        <w:tc>
+          <w:tcPr>
+            <w:tcW w:w="3117" w:type="dxa"/>
+          </w:tcPr>
+          <w:p>
+            <w:pPr>
+              <w:rPr>
+                <w:b w:val="0"/>
+                <w:bCs w:val="0"/>
+                <w:color w:val="auto"/>
+              </w:rPr>
+            </w:pPr>
+            <w:r>
+              <w:rPr>
+                <w:b w:val="0"/>
+                <w:bCs w:val="0"/>
+                <w:color w:val="auto"/>
+              </w:rPr>
+              <w:t>Purpose</w:t>
+            </w:r>
+          </w:p>
+        </w:tc>
+        <w:tc>
+          <w:tcPr>
+            <w:tcW w:w="3117" w:type="dxa"/>
+          </w:tcPr>
+          <w:p>
+            <w:pPr>
+              <w:rPr>
+                <w:b w:val="0"/>
+                <w:bCs w:val="0"/>
+                <w:color w:val="auto"/>
+              </w:rPr>
+            </w:pPr>
+            <w:r>
+              <w:rPr>
+                <w:b w:val="0"/>
+                <w:bCs w:val="0"/>
+                <w:color w:val="auto"/>
+              </w:rPr>
+              <w:t>Example Fields</w:t>
+            </w:r>
+          </w:p>
+        </w:tc>
+      </w:tr>
+      <w:tr>
+        <w:trPr>
+          <w:cnfStyle w:val="000000100000" w:firstRow="0" w:lastRow="0" w:firstColumn="0" w:lastColumn="0" w:oddVBand="0" w:evenVBand="0" w:oddHBand="1" w:evenHBand="0" w:firstRowFirstColumn="0" w:firstRowLastColumn="0" w:lastRowFirstColumn="0" w:lastRowLastColumn="0"/>
+        </w:trPr>
+        <w:tc>
+          <w:tcPr>
+            <w:tcW w:w="3116" w:type="dxa"/>
+          </w:tcPr>
+          <w:p>
+            <w:r>
+              <w:t>Task</w:t>
+            </w:r>
+          </w:p>
+        </w:tc>
+        <w:tc>
+          <w:tcPr>
+            <w:tcW w:w="3117" w:type="dxa"/>
+          </w:tcPr>
+          <w:p>
+            <w:r>
+              <w:t>Stores Task Information</w:t>
+            </w:r>
+          </w:p>
+        </w:tc>
+        <w:tc>
+          <w:tcPr>
+            <w:tcW w:w="3117" w:type="dxa"/>
+          </w:tcPr>
+          <w:p>
+            <w:proofErr w:type="spellStart"/>
+            <w:r>
+              <w:t>TaskId</w:t>
+            </w:r>
+            <w:proofErr w:type="spellEnd"/>
+            <w:r>
+              <w:t>, Title, Description, Date Created, Date Due.</w:t>
+            </w:r>
+          </w:p>
+        </w:tc>
+      </w:tr>
+      <w:tr>
+        <w:tc>
+          <w:tcPr>
+            <w:tcW w:w="3116" w:type="dxa"/>
+          </w:tcPr>
+          <w:p>
+            <w:r>
+              <w:t>Schedule</w:t>
+            </w:r>
+          </w:p>
+        </w:tc>
+        <w:tc>
+          <w:tcPr>
+            <w:tcW w:w="3117" w:type="dxa"/>
+          </w:tcPr>
+          <w:p>
+            <w:r>
+              <w:t>Stores Tasks and User info for their specific Schedule</w:t>
+            </w:r>
+          </w:p>
+        </w:tc>
+        <w:tc>
+          <w:tcPr>
+            <w:tcW w:w="3117" w:type="dxa"/>
+          </w:tcPr>
+          <w:p>
+            <w:proofErr w:type="spellStart"/>
+            <w:r>
+              <w:t>TaskId</w:t>
+            </w:r>
+            <w:proofErr w:type="spellEnd"/>
+            <w:r>
+              <w:t xml:space="preserve">, </w:t>
+            </w:r>
+            <w:proofErr w:type="spellStart"/>
+            <w:r>
+              <w:t>UserId</w:t>
+            </w:r>
+            <w:proofErr w:type="spellEnd"/>
+            <w:r>
+              <w:t>, Notification</w:t>
+            </w:r>
+            <w:r>
+              <w:t xml:space="preserve"> Setting</w:t>
+            </w:r>
+          </w:p>
+        </w:tc>
+      </w:tr>
+      <w:tr>
+        <w:trPr>
+          <w:cnfStyle w:val="000000100000" w:firstRow="0" w:lastRow="0" w:firstColumn="0" w:lastColumn="0" w:oddVBand="0" w:evenVBand="0" w:oddHBand="1" w:evenHBand="0" w:firstRowFirstColumn="0" w:firstRowLastColumn="0" w:lastRowFirstColumn="0" w:lastRowLastColumn="0"/>
+        </w:trPr>
+        <w:tc>
+          <w:tcPr>
+            <w:tcW w:w="3116" w:type="dxa"/>
+          </w:tcPr>
+          <w:p>
+            <w:r>
+              <w:t>User</w:t>
+            </w:r>
+          </w:p>
+        </w:tc>
+        <w:tc>
+          <w:tcPr>
+            <w:tcW w:w="3117" w:type="dxa"/>
+          </w:tcPr>
+          <w:p>
+            <w:r>
+              <w:t>Stores User Information</w:t>
+            </w:r>
+          </w:p>
+        </w:tc>
+        <w:tc>
+          <w:tcPr>
+            <w:tcW w:w="3117" w:type="dxa"/>
+          </w:tcPr>
+          <w:p>
+            <w:proofErr w:type="spellStart"/>
+            <w:r>
+              <w:t>UserId</w:t>
+            </w:r>
+            <w:proofErr w:type="spellEnd"/>
+            <w:r>
+              <w:t>, Name, Email, Password, Role</w:t>
+            </w:r>
+          </w:p>
+        </w:tc>
+      </w:tr>
+    </w:tbl>
+    <w:p/>
+    <w:p>
+      <w:pPr>
+        <w:pStyle w:val="Heading1"/>
+      </w:pPr>
+      <w:r>
+        <w:t xml:space="preserve">Planned </w:t>
+      </w:r>
+      <w:proofErr w:type="spellStart"/>
+      <w:r>
+        <w:t>Javascript</w:t>
+      </w:r>
+      <w:proofErr w:type="spellEnd"/>
+      <w:r>
+        <w:t xml:space="preserve"> Features</w:t>
+      </w:r>
+    </w:p>
+    <w:p>
+      <w:r>
+        <w:t xml:space="preserve">I plan to use </w:t>
+      </w:r>
+      <w:proofErr w:type="spellStart"/>
+      <w:r>
+        <w:t>Javascript</w:t>
+      </w:r>
+      <w:proofErr w:type="spellEnd"/>
+      <w:r>
+        <w:t xml:space="preserve"> to make my website more dynamic than a standard </w:t>
+      </w:r>
+      <w:proofErr w:type="gramStart"/>
+      <w:r>
+        <w:t>html based</w:t>
+      </w:r>
+      <w:proofErr w:type="gramEnd"/>
+      <w:r>
+        <w:t xml:space="preserve"> web application. I intend to use </w:t>
+      </w:r>
+      <w:proofErr w:type="spellStart"/>
+      <w:r>
+        <w:t>javascript</w:t>
+      </w:r>
+      <w:proofErr w:type="spellEnd"/>
+      <w:r>
+        <w:t xml:space="preserve"> to display forms that overlay on top of the base layout of certain pages. When a user completes one of these forms, I will use </w:t>
+      </w:r>
+      <w:proofErr w:type="spellStart"/>
+      <w:r>
+        <w:t>javascript</w:t>
+      </w:r>
+      <w:proofErr w:type="spellEnd"/>
+      <w:r>
+        <w:t xml:space="preserve"> to hide the form and update the page without reloading. I will also use </w:t>
+      </w:r>
+      <w:proofErr w:type="spellStart"/>
+      <w:r>
+        <w:t>javascript</w:t>
+      </w:r>
+      <w:proofErr w:type="spellEnd"/>
+      <w:r>
+        <w:t xml:space="preserve"> to dynamically change the appearance of certain elements in response to user actions.</w:t>
+      </w:r>
+    </w:p>
+    <w:p>
+      <w:pPr>
+        <w:pStyle w:val="Heading1"/>
+      </w:pPr>
+      <w:r>
+        <w:t>Major Features</w:t>
+      </w:r>
+    </w:p>
+    <w:p>
+      <w:pPr>
+        <w:numPr>
+          <w:ilvl w:val="0"/>
+          <w:numId w:val="2"/>
+        </w:numPr>
+      </w:pPr>
+      <w:r>
+        <w:t>User login/logout</w:t>
+      </w:r>
+      <w:r>
+        <w:t xml:space="preserve"> – Have a dedicated page for users to login with as well as a button in the header for logging in or out.</w:t>
+      </w:r>
+    </w:p>
+    <w:p>
+      <w:pPr>
+        <w:numPr>
+          <w:ilvl w:val="0"/>
+          <w:numId w:val="2"/>
+        </w:numPr>
+      </w:pPr>
+      <w:r>
+        <w:t>User registration</w:t>
+      </w:r>
+      <w:r>
+        <w:t xml:space="preserve"> – A page for registering new users, input will be validated and password complexity requirements will be enforced.</w:t>
+      </w:r>
+    </w:p>
+    <w:p>
+      <w:pPr>
+        <w:numPr>
+          <w:ilvl w:val="0"/>
+          <w:numId w:val="2"/>
+        </w:numPr>
+      </w:pPr>
+      <w:r>
+        <w:t>Admin dashboard</w:t>
+      </w:r>
+      <w:r>
+        <w:t xml:space="preserve"> – A page for managing users as well as custom versions of pages that display all user data</w:t>
+      </w:r>
+    </w:p>
+    <w:p>
+      <w:pPr>
+        <w:numPr>
+          <w:ilvl w:val="0"/>
+          <w:numId w:val="2"/>
+        </w:numPr>
+      </w:pPr>
+      <w:r>
+        <w:t>Add/edit/delete records</w:t>
+      </w:r>
+      <w:r>
+        <w:t xml:space="preserve"> – A dynamic menu(s) </w:t>
+      </w:r>
+      <w:r>
+        <w:t xml:space="preserve">for managing different types of data. </w:t>
+      </w:r>
+    </w:p>
+    <w:p>
+      <w:pPr>
+        <w:numPr>
+          <w:ilvl w:val="0"/>
+          <w:numId w:val="2"/>
+        </w:numPr>
+        <w:shd w:val="clear" w:color="auto" w:fill="FFFFFF"/>
+        <w:spacing w:before="100" w:beforeAutospacing="1" w:after="100" w:afterAutospacing="1" w:line="240" w:lineRule="auto"/>
+        <w:rPr>
+          <w:rFonts w:ascii="Lato" w:eastAsia="Times New Roman" w:hAnsi="Lato" w:cs="Times New Roman"/>
+          <w:color w:val="273540"/>
+          <w:kern w:val="0"/>
+          <w14:ligatures w14:val="none"/>
+        </w:rPr>
+      </w:pPr>
+      <w:r>
+        <w:rPr>
+          <w:rFonts w:ascii="Lato" w:eastAsia="Times New Roman" w:hAnsi="Lato" w:cs="Times New Roman"/>
+          <w:color w:val="273540"/>
+          <w:kern w:val="0"/>
+          <w14:ligatures w14:val="none"/>
+        </w:rPr>
+        <w:t>Generate reports</w:t>
+      </w:r>
+      <w:r>
+        <w:rPr>
+          <w:rFonts w:ascii="Lato" w:eastAsia="Times New Roman" w:hAnsi="Lato" w:cs="Times New Roman"/>
+          <w:color w:val="273540"/>
+          <w:kern w:val="0"/>
+          <w14:ligatures w14:val="none"/>
+        </w:rPr>
+        <w:t xml:space="preserve"> – User account page will have a section with a report for how they did in the current week. Either with a graphical display of completion percentage or a list of tasks completed or not completed</w:t>
+      </w:r>
+    </w:p>
     <w:p/>
     <w:sectPr>
       <w:pgSz w:w="12240" w:h="15840"/>
@@ -11,6 +631,467 @@
     </w:sectPr>
   </w:body>
 </w:document>
+</file>
+
+<file path=word/numbering.xml><?xml version="1.0" encoding="utf-8"?>
+<w:numbering xmlns:wpc="http://schemas.microsoft.com/office/word/2010/wordprocessingCanvas" xmlns:cx="http://schemas.microsoft.com/office/drawing/2014/chartex" xmlns:cx1="http://schemas.microsoft.com/office/drawing/2015/9/8/chartex" xmlns:cx2="http://schemas.microsoft.com/office/drawing/2015/10/21/chartex" xmlns:cx3="http://schemas.microsoft.com/office/drawing/2016/5/9/chartex" xmlns:cx4="http://schemas.microsoft.com/office/drawing/2016/5/10/chartex" xmlns:cx5="http://schemas.microsoft.com/office/drawing/2016/5/11/chartex" xmlns:cx6="http://schemas.microsoft.com/office/drawing/2016/5/12/chartex" xmlns:cx7="http://schemas.microsoft.com/office/drawing/2016/5/13/chartex" xmlns:cx8="http://schemas.microsoft.com/office/drawing/2016/5/14/chartex" xmlns:mc="http://schemas.openxmlformats.org/markup-compatibility/2006" xmlns:aink="http://schemas.microsoft.com/office/drawing/2016/ink" xmlns:am3d="http://schemas.microsoft.com/office/drawing/2017/model3d" xmlns:o="urn:schemas-microsoft-com:office:office" xmlns:oel="http://schemas.microsoft.com/office/2019/extlst" xmlns:r="http://schemas.openxmlformats.org/officeDocument/2006/relationships" xmlns:m="http://schemas.openxmlformats.org/officeDocument/2006/math" xmlns:v="urn:schemas-microsoft-com:vml" xmlns:wp14="http://schemas.microsoft.com/office/word/2010/wordprocessingDrawing" xmlns:wp="http://schemas.openxmlformats.org/drawingml/2006/wordprocessingDrawing" xmlns:w10="urn:schemas-microsoft-com:office:word" xmlns:w="http://schemas.openxmlformats.org/wordprocessingml/2006/main" xmlns:w14="http://schemas.microsoft.com/office/word/2010/wordml" xmlns:w15="http://schemas.microsoft.com/office/word/2012/wordml" xmlns:w16cex="http://schemas.microsoft.com/office/word/2018/wordml/cex" xmlns:w16cid="http://schemas.microsoft.com/office/word/2016/wordml/cid" xmlns:w16="http://schemas.microsoft.com/office/word/2018/wordml" xmlns:w16du="http://schemas.microsoft.com/office/word/2023/wordml/word16du" xmlns:w16sdtdh="http://schemas.microsoft.com/office/word/2020/wordml/sdtdatahash" xmlns:w16sdtfl="http://schemas.microsoft.com/office/word/2024/wordml/sdtformatlock" xmlns:w16se="http://schemas.microsoft.com/office/word/2015/wordml/symex" xmlns:wpg="http://schemas.microsoft.com/office/word/2010/wordprocessingGroup" xmlns:wpi="http://schemas.microsoft.com/office/word/2010/wordprocessingInk" xmlns:wne="http://schemas.microsoft.com/office/word/2006/wordml" xmlns:wps="http://schemas.microsoft.com/office/word/2010/wordprocessingShape" mc:Ignorable="w14 w15 w16se w16cid w16 w16cex w16sdtdh w16sdtfl w16du wp14">
+  <w:abstractNum w:abstractNumId="0" w15:restartNumberingAfterBreak="0">
+    <w:nsid w:val="219869C0"/>
+    <w:multiLevelType w:val="multilevel"/>
+    <w:tmpl w:val="82CC2F2C"/>
+    <w:lvl w:ilvl="0">
+      <w:start w:val="1"/>
+      <w:numFmt w:val="bullet"/>
+      <w:lvlText w:val=""/>
+      <w:lvlJc w:val="left"/>
+      <w:pPr>
+        <w:tabs>
+          <w:tab w:val="num" w:pos="720"/>
+        </w:tabs>
+        <w:ind w:left="720" w:hanging="360"/>
+      </w:pPr>
+      <w:rPr>
+        <w:rFonts w:ascii="Symbol" w:hAnsi="Symbol" w:hint="default"/>
+        <w:sz w:val="20"/>
+      </w:rPr>
+    </w:lvl>
+    <w:lvl w:ilvl="1" w:tentative="1">
+      <w:start w:val="1"/>
+      <w:numFmt w:val="bullet"/>
+      <w:lvlText w:val="o"/>
+      <w:lvlJc w:val="left"/>
+      <w:pPr>
+        <w:tabs>
+          <w:tab w:val="num" w:pos="1440"/>
+        </w:tabs>
+        <w:ind w:left="1440" w:hanging="360"/>
+      </w:pPr>
+      <w:rPr>
+        <w:rFonts w:ascii="Courier New" w:hAnsi="Courier New" w:hint="default"/>
+        <w:sz w:val="20"/>
+      </w:rPr>
+    </w:lvl>
+    <w:lvl w:ilvl="2" w:tentative="1">
+      <w:start w:val="1"/>
+      <w:numFmt w:val="bullet"/>
+      <w:lvlText w:val=""/>
+      <w:lvlJc w:val="left"/>
+      <w:pPr>
+        <w:tabs>
+          <w:tab w:val="num" w:pos="2160"/>
+        </w:tabs>
+        <w:ind w:left="2160" w:hanging="360"/>
+      </w:pPr>
+      <w:rPr>
+        <w:rFonts w:ascii="Wingdings" w:hAnsi="Wingdings" w:hint="default"/>
+        <w:sz w:val="20"/>
+      </w:rPr>
+    </w:lvl>
+    <w:lvl w:ilvl="3" w:tentative="1">
+      <w:start w:val="1"/>
+      <w:numFmt w:val="bullet"/>
+      <w:lvlText w:val=""/>
+      <w:lvlJc w:val="left"/>
+      <w:pPr>
+        <w:tabs>
+          <w:tab w:val="num" w:pos="2880"/>
+        </w:tabs>
+        <w:ind w:left="2880" w:hanging="360"/>
+      </w:pPr>
+      <w:rPr>
+        <w:rFonts w:ascii="Wingdings" w:hAnsi="Wingdings" w:hint="default"/>
+        <w:sz w:val="20"/>
+      </w:rPr>
+    </w:lvl>
+    <w:lvl w:ilvl="4" w:tentative="1">
+      <w:start w:val="1"/>
+      <w:numFmt w:val="bullet"/>
+      <w:lvlText w:val=""/>
+      <w:lvlJc w:val="left"/>
+      <w:pPr>
+        <w:tabs>
+          <w:tab w:val="num" w:pos="3600"/>
+        </w:tabs>
+        <w:ind w:left="3600" w:hanging="360"/>
+      </w:pPr>
+      <w:rPr>
+        <w:rFonts w:ascii="Wingdings" w:hAnsi="Wingdings" w:hint="default"/>
+        <w:sz w:val="20"/>
+      </w:rPr>
+    </w:lvl>
+    <w:lvl w:ilvl="5" w:tentative="1">
+      <w:start w:val="1"/>
+      <w:numFmt w:val="bullet"/>
+      <w:lvlText w:val=""/>
+      <w:lvlJc w:val="left"/>
+      <w:pPr>
+        <w:tabs>
+          <w:tab w:val="num" w:pos="4320"/>
+        </w:tabs>
+        <w:ind w:left="4320" w:hanging="360"/>
+      </w:pPr>
+      <w:rPr>
+        <w:rFonts w:ascii="Wingdings" w:hAnsi="Wingdings" w:hint="default"/>
+        <w:sz w:val="20"/>
+      </w:rPr>
+    </w:lvl>
+    <w:lvl w:ilvl="6" w:tentative="1">
+      <w:start w:val="1"/>
+      <w:numFmt w:val="bullet"/>
+      <w:lvlText w:val=""/>
+      <w:lvlJc w:val="left"/>
+      <w:pPr>
+        <w:tabs>
+          <w:tab w:val="num" w:pos="5040"/>
+        </w:tabs>
+        <w:ind w:left="5040" w:hanging="360"/>
+      </w:pPr>
+      <w:rPr>
+        <w:rFonts w:ascii="Wingdings" w:hAnsi="Wingdings" w:hint="default"/>
+        <w:sz w:val="20"/>
+      </w:rPr>
+    </w:lvl>
+    <w:lvl w:ilvl="7" w:tentative="1">
+      <w:start w:val="1"/>
+      <w:numFmt w:val="bullet"/>
+      <w:lvlText w:val=""/>
+      <w:lvlJc w:val="left"/>
+      <w:pPr>
+        <w:tabs>
+          <w:tab w:val="num" w:pos="5760"/>
+        </w:tabs>
+        <w:ind w:left="5760" w:hanging="360"/>
+      </w:pPr>
+      <w:rPr>
+        <w:rFonts w:ascii="Wingdings" w:hAnsi="Wingdings" w:hint="default"/>
+        <w:sz w:val="20"/>
+      </w:rPr>
+    </w:lvl>
+    <w:lvl w:ilvl="8" w:tentative="1">
+      <w:start w:val="1"/>
+      <w:numFmt w:val="bullet"/>
+      <w:lvlText w:val=""/>
+      <w:lvlJc w:val="left"/>
+      <w:pPr>
+        <w:tabs>
+          <w:tab w:val="num" w:pos="6480"/>
+        </w:tabs>
+        <w:ind w:left="6480" w:hanging="360"/>
+      </w:pPr>
+      <w:rPr>
+        <w:rFonts w:ascii="Wingdings" w:hAnsi="Wingdings" w:hint="default"/>
+        <w:sz w:val="20"/>
+      </w:rPr>
+    </w:lvl>
+  </w:abstractNum>
+  <w:abstractNum w:abstractNumId="1" w15:restartNumberingAfterBreak="0">
+    <w:nsid w:val="70D15769"/>
+    <w:multiLevelType w:val="multilevel"/>
+    <w:tmpl w:val="1C263F9A"/>
+    <w:lvl w:ilvl="0">
+      <w:start w:val="1"/>
+      <w:numFmt w:val="bullet"/>
+      <w:lvlText w:val=""/>
+      <w:lvlJc w:val="left"/>
+      <w:pPr>
+        <w:tabs>
+          <w:tab w:val="num" w:pos="720"/>
+        </w:tabs>
+        <w:ind w:left="720" w:hanging="360"/>
+      </w:pPr>
+      <w:rPr>
+        <w:rFonts w:ascii="Symbol" w:hAnsi="Symbol" w:hint="default"/>
+        <w:sz w:val="20"/>
+      </w:rPr>
+    </w:lvl>
+    <w:lvl w:ilvl="1" w:tentative="1">
+      <w:start w:val="1"/>
+      <w:numFmt w:val="bullet"/>
+      <w:lvlText w:val="o"/>
+      <w:lvlJc w:val="left"/>
+      <w:pPr>
+        <w:tabs>
+          <w:tab w:val="num" w:pos="1440"/>
+        </w:tabs>
+        <w:ind w:left="1440" w:hanging="360"/>
+      </w:pPr>
+      <w:rPr>
+        <w:rFonts w:ascii="Courier New" w:hAnsi="Courier New" w:hint="default"/>
+        <w:sz w:val="20"/>
+      </w:rPr>
+    </w:lvl>
+    <w:lvl w:ilvl="2" w:tentative="1">
+      <w:start w:val="1"/>
+      <w:numFmt w:val="bullet"/>
+      <w:lvlText w:val=""/>
+      <w:lvlJc w:val="left"/>
+      <w:pPr>
+        <w:tabs>
+          <w:tab w:val="num" w:pos="2160"/>
+        </w:tabs>
+        <w:ind w:left="2160" w:hanging="360"/>
+      </w:pPr>
+      <w:rPr>
+        <w:rFonts w:ascii="Wingdings" w:hAnsi="Wingdings" w:hint="default"/>
+        <w:sz w:val="20"/>
+      </w:rPr>
+    </w:lvl>
+    <w:lvl w:ilvl="3" w:tentative="1">
+      <w:start w:val="1"/>
+      <w:numFmt w:val="bullet"/>
+      <w:lvlText w:val=""/>
+      <w:lvlJc w:val="left"/>
+      <w:pPr>
+        <w:tabs>
+          <w:tab w:val="num" w:pos="2880"/>
+        </w:tabs>
+        <w:ind w:left="2880" w:hanging="360"/>
+      </w:pPr>
+      <w:rPr>
+        <w:rFonts w:ascii="Wingdings" w:hAnsi="Wingdings" w:hint="default"/>
+        <w:sz w:val="20"/>
+      </w:rPr>
+    </w:lvl>
+    <w:lvl w:ilvl="4" w:tentative="1">
+      <w:start w:val="1"/>
+      <w:numFmt w:val="bullet"/>
+      <w:lvlText w:val=""/>
+      <w:lvlJc w:val="left"/>
+      <w:pPr>
+        <w:tabs>
+          <w:tab w:val="num" w:pos="3600"/>
+        </w:tabs>
+        <w:ind w:left="3600" w:hanging="360"/>
+      </w:pPr>
+      <w:rPr>
+        <w:rFonts w:ascii="Wingdings" w:hAnsi="Wingdings" w:hint="default"/>
+        <w:sz w:val="20"/>
+      </w:rPr>
+    </w:lvl>
+    <w:lvl w:ilvl="5" w:tentative="1">
+      <w:start w:val="1"/>
+      <w:numFmt w:val="bullet"/>
+      <w:lvlText w:val=""/>
+      <w:lvlJc w:val="left"/>
+      <w:pPr>
+        <w:tabs>
+          <w:tab w:val="num" w:pos="4320"/>
+        </w:tabs>
+        <w:ind w:left="4320" w:hanging="360"/>
+      </w:pPr>
+      <w:rPr>
+        <w:rFonts w:ascii="Wingdings" w:hAnsi="Wingdings" w:hint="default"/>
+        <w:sz w:val="20"/>
+      </w:rPr>
+    </w:lvl>
+    <w:lvl w:ilvl="6" w:tentative="1">
+      <w:start w:val="1"/>
+      <w:numFmt w:val="bullet"/>
+      <w:lvlText w:val=""/>
+      <w:lvlJc w:val="left"/>
+      <w:pPr>
+        <w:tabs>
+          <w:tab w:val="num" w:pos="5040"/>
+        </w:tabs>
+        <w:ind w:left="5040" w:hanging="360"/>
+      </w:pPr>
+      <w:rPr>
+        <w:rFonts w:ascii="Wingdings" w:hAnsi="Wingdings" w:hint="default"/>
+        <w:sz w:val="20"/>
+      </w:rPr>
+    </w:lvl>
+    <w:lvl w:ilvl="7" w:tentative="1">
+      <w:start w:val="1"/>
+      <w:numFmt w:val="bullet"/>
+      <w:lvlText w:val=""/>
+      <w:lvlJc w:val="left"/>
+      <w:pPr>
+        <w:tabs>
+          <w:tab w:val="num" w:pos="5760"/>
+        </w:tabs>
+        <w:ind w:left="5760" w:hanging="360"/>
+      </w:pPr>
+      <w:rPr>
+        <w:rFonts w:ascii="Wingdings" w:hAnsi="Wingdings" w:hint="default"/>
+        <w:sz w:val="20"/>
+      </w:rPr>
+    </w:lvl>
+    <w:lvl w:ilvl="8" w:tentative="1">
+      <w:start w:val="1"/>
+      <w:numFmt w:val="bullet"/>
+      <w:lvlText w:val=""/>
+      <w:lvlJc w:val="left"/>
+      <w:pPr>
+        <w:tabs>
+          <w:tab w:val="num" w:pos="6480"/>
+        </w:tabs>
+        <w:ind w:left="6480" w:hanging="360"/>
+      </w:pPr>
+      <w:rPr>
+        <w:rFonts w:ascii="Wingdings" w:hAnsi="Wingdings" w:hint="default"/>
+        <w:sz w:val="20"/>
+      </w:rPr>
+    </w:lvl>
+  </w:abstractNum>
+  <w:abstractNum w:abstractNumId="2" w15:restartNumberingAfterBreak="0">
+    <w:nsid w:val="73DE52B7"/>
+    <w:multiLevelType w:val="multilevel"/>
+    <w:tmpl w:val="E4A64A20"/>
+    <w:lvl w:ilvl="0">
+      <w:start w:val="1"/>
+      <w:numFmt w:val="bullet"/>
+      <w:lvlText w:val=""/>
+      <w:lvlJc w:val="left"/>
+      <w:pPr>
+        <w:tabs>
+          <w:tab w:val="num" w:pos="720"/>
+        </w:tabs>
+        <w:ind w:left="720" w:hanging="360"/>
+      </w:pPr>
+      <w:rPr>
+        <w:rFonts w:ascii="Symbol" w:hAnsi="Symbol" w:hint="default"/>
+        <w:sz w:val="20"/>
+      </w:rPr>
+    </w:lvl>
+    <w:lvl w:ilvl="1" w:tentative="1">
+      <w:start w:val="1"/>
+      <w:numFmt w:val="bullet"/>
+      <w:lvlText w:val="o"/>
+      <w:lvlJc w:val="left"/>
+      <w:pPr>
+        <w:tabs>
+          <w:tab w:val="num" w:pos="1440"/>
+        </w:tabs>
+        <w:ind w:left="1440" w:hanging="360"/>
+      </w:pPr>
+      <w:rPr>
+        <w:rFonts w:ascii="Courier New" w:hAnsi="Courier New" w:hint="default"/>
+        <w:sz w:val="20"/>
+      </w:rPr>
+    </w:lvl>
+    <w:lvl w:ilvl="2" w:tentative="1">
+      <w:start w:val="1"/>
+      <w:numFmt w:val="bullet"/>
+      <w:lvlText w:val=""/>
+      <w:lvlJc w:val="left"/>
+      <w:pPr>
+        <w:tabs>
+          <w:tab w:val="num" w:pos="2160"/>
+        </w:tabs>
+        <w:ind w:left="2160" w:hanging="360"/>
+      </w:pPr>
+      <w:rPr>
+        <w:rFonts w:ascii="Wingdings" w:hAnsi="Wingdings" w:hint="default"/>
+        <w:sz w:val="20"/>
+      </w:rPr>
+    </w:lvl>
+    <w:lvl w:ilvl="3" w:tentative="1">
+      <w:start w:val="1"/>
+      <w:numFmt w:val="bullet"/>
+      <w:lvlText w:val=""/>
+      <w:lvlJc w:val="left"/>
+      <w:pPr>
+        <w:tabs>
+          <w:tab w:val="num" w:pos="2880"/>
+        </w:tabs>
+        <w:ind w:left="2880" w:hanging="360"/>
+      </w:pPr>
+      <w:rPr>
+        <w:rFonts w:ascii="Wingdings" w:hAnsi="Wingdings" w:hint="default"/>
+        <w:sz w:val="20"/>
+      </w:rPr>
+    </w:lvl>
+    <w:lvl w:ilvl="4" w:tentative="1">
+      <w:start w:val="1"/>
+      <w:numFmt w:val="bullet"/>
+      <w:lvlText w:val=""/>
+      <w:lvlJc w:val="left"/>
+      <w:pPr>
+        <w:tabs>
+          <w:tab w:val="num" w:pos="3600"/>
+        </w:tabs>
+        <w:ind w:left="3600" w:hanging="360"/>
+      </w:pPr>
+      <w:rPr>
+        <w:rFonts w:ascii="Wingdings" w:hAnsi="Wingdings" w:hint="default"/>
+        <w:sz w:val="20"/>
+      </w:rPr>
+    </w:lvl>
+    <w:lvl w:ilvl="5" w:tentative="1">
+      <w:start w:val="1"/>
+      <w:numFmt w:val="bullet"/>
+      <w:lvlText w:val=""/>
+      <w:lvlJc w:val="left"/>
+      <w:pPr>
+        <w:tabs>
+          <w:tab w:val="num" w:pos="4320"/>
+        </w:tabs>
+        <w:ind w:left="4320" w:hanging="360"/>
+      </w:pPr>
+      <w:rPr>
+        <w:rFonts w:ascii="Wingdings" w:hAnsi="Wingdings" w:hint="default"/>
+        <w:sz w:val="20"/>
+      </w:rPr>
+    </w:lvl>
+    <w:lvl w:ilvl="6" w:tentative="1">
+      <w:start w:val="1"/>
+      <w:numFmt w:val="bullet"/>
+      <w:lvlText w:val=""/>
+      <w:lvlJc w:val="left"/>
+      <w:pPr>
+        <w:tabs>
+          <w:tab w:val="num" w:pos="5040"/>
+        </w:tabs>
+        <w:ind w:left="5040" w:hanging="360"/>
+      </w:pPr>
+      <w:rPr>
+        <w:rFonts w:ascii="Wingdings" w:hAnsi="Wingdings" w:hint="default"/>
+        <w:sz w:val="20"/>
+      </w:rPr>
+    </w:lvl>
+    <w:lvl w:ilvl="7" w:tentative="1">
+      <w:start w:val="1"/>
+      <w:numFmt w:val="bullet"/>
+      <w:lvlText w:val=""/>
+      <w:lvlJc w:val="left"/>
+      <w:pPr>
+        <w:tabs>
+          <w:tab w:val="num" w:pos="5760"/>
+        </w:tabs>
+        <w:ind w:left="5760" w:hanging="360"/>
+      </w:pPr>
+      <w:rPr>
+        <w:rFonts w:ascii="Wingdings" w:hAnsi="Wingdings" w:hint="default"/>
+        <w:sz w:val="20"/>
+      </w:rPr>
+    </w:lvl>
+    <w:lvl w:ilvl="8" w:tentative="1">
+      <w:start w:val="1"/>
+      <w:numFmt w:val="bullet"/>
+      <w:lvlText w:val=""/>
+      <w:lvlJc w:val="left"/>
+      <w:pPr>
+        <w:tabs>
+          <w:tab w:val="num" w:pos="6480"/>
+        </w:tabs>
+        <w:ind w:left="6480" w:hanging="360"/>
+      </w:pPr>
+      <w:rPr>
+        <w:rFonts w:ascii="Wingdings" w:hAnsi="Wingdings" w:hint="default"/>
+        <w:sz w:val="20"/>
+      </w:rPr>
+    </w:lvl>
+  </w:abstractNum>
+  <w:num w:numId="1" w16cid:durableId="553661385">
+    <w:abstractNumId w:val="2"/>
+  </w:num>
+  <w:num w:numId="2" w16cid:durableId="2027053197">
+    <w:abstractNumId w:val="0"/>
+  </w:num>
+  <w:num w:numId="3" w16cid:durableId="829177604">
+    <w:abstractNumId w:val="1"/>
+  </w:num>
+</w:numbering>
 </file>
 
 <file path=word/styles.xml><?xml version="1.0" encoding="utf-8"?>
@@ -430,7 +1511,7 @@
     </w:pPr>
     <w:rPr>
       <w:rFonts w:asciiTheme="majorHAnsi" w:eastAsiaTheme="majorEastAsia" w:hAnsiTheme="majorHAnsi" w:cstheme="majorBidi"/>
-      <w:color w:val="0F4761" w:themeColor="accent1" w:themeShade="BF"/>
+      <w:color w:val="BF8F00" w:themeColor="accent1" w:themeShade="BF"/>
       <w:sz w:val="40"/>
       <w:szCs w:val="40"/>
     </w:rPr>
@@ -453,7 +1534,7 @@
     </w:pPr>
     <w:rPr>
       <w:rFonts w:asciiTheme="majorHAnsi" w:eastAsiaTheme="majorEastAsia" w:hAnsiTheme="majorHAnsi" w:cstheme="majorBidi"/>
-      <w:color w:val="0F4761" w:themeColor="accent1" w:themeShade="BF"/>
+      <w:color w:val="BF8F00" w:themeColor="accent1" w:themeShade="BF"/>
       <w:sz w:val="32"/>
       <w:szCs w:val="32"/>
     </w:rPr>
@@ -476,7 +1557,7 @@
     </w:pPr>
     <w:rPr>
       <w:rFonts w:eastAsiaTheme="majorEastAsia" w:cstheme="majorBidi"/>
-      <w:color w:val="0F4761" w:themeColor="accent1" w:themeShade="BF"/>
+      <w:color w:val="BF8F00" w:themeColor="accent1" w:themeShade="BF"/>
       <w:sz w:val="28"/>
       <w:szCs w:val="28"/>
     </w:rPr>
@@ -501,7 +1582,7 @@
       <w:rFonts w:eastAsiaTheme="majorEastAsia" w:cstheme="majorBidi"/>
       <w:i/>
       <w:iCs/>
-      <w:color w:val="0F4761" w:themeColor="accent1" w:themeShade="BF"/>
+      <w:color w:val="BF8F00" w:themeColor="accent1" w:themeShade="BF"/>
     </w:rPr>
   </w:style>
   <w:style w:type="paragraph" w:styleId="Heading5">
@@ -522,7 +1603,7 @@
     </w:pPr>
     <w:rPr>
       <w:rFonts w:eastAsiaTheme="majorEastAsia" w:cstheme="majorBidi"/>
-      <w:color w:val="0F4761" w:themeColor="accent1" w:themeShade="BF"/>
+      <w:color w:val="BF8F00" w:themeColor="accent1" w:themeShade="BF"/>
     </w:rPr>
   </w:style>
   <w:style w:type="paragraph" w:styleId="Heading6">
@@ -545,7 +1626,7 @@
       <w:rFonts w:eastAsiaTheme="majorEastAsia" w:cstheme="majorBidi"/>
       <w:i/>
       <w:iCs/>
-      <w:color w:val="595959" w:themeColor="text1" w:themeTint="A6"/>
+      <w:color w:val="757575" w:themeColor="text1" w:themeTint="A6"/>
     </w:rPr>
   </w:style>
   <w:style w:type="paragraph" w:styleId="Heading7">
@@ -566,7 +1647,7 @@
     </w:pPr>
     <w:rPr>
       <w:rFonts w:eastAsiaTheme="majorEastAsia" w:cstheme="majorBidi"/>
-      <w:color w:val="595959" w:themeColor="text1" w:themeTint="A6"/>
+      <w:color w:val="757575" w:themeColor="text1" w:themeTint="A6"/>
     </w:rPr>
   </w:style>
   <w:style w:type="paragraph" w:styleId="Heading8">
@@ -589,7 +1670,7 @@
       <w:rFonts w:eastAsiaTheme="majorEastAsia" w:cstheme="majorBidi"/>
       <w:i/>
       <w:iCs/>
-      <w:color w:val="272727" w:themeColor="text1" w:themeTint="D8"/>
+      <w:color w:val="4C4C4C" w:themeColor="text1" w:themeTint="D8"/>
     </w:rPr>
   </w:style>
   <w:style w:type="paragraph" w:styleId="Heading9">
@@ -610,13 +1691,12 @@
     </w:pPr>
     <w:rPr>
       <w:rFonts w:eastAsiaTheme="majorEastAsia" w:cstheme="majorBidi"/>
-      <w:color w:val="272727" w:themeColor="text1" w:themeTint="D8"/>
+      <w:color w:val="4C4C4C" w:themeColor="text1" w:themeTint="D8"/>
     </w:rPr>
   </w:style>
   <w:style w:type="character" w:default="1" w:styleId="DefaultParagraphFont">
     <w:name w:val="Default Paragraph Font"/>
     <w:uiPriority w:val="1"/>
-    <w:semiHidden/>
     <w:unhideWhenUsed/>
   </w:style>
   <w:style w:type="table" w:default="1" w:styleId="TableNormal">
@@ -648,7 +1728,7 @@
     <w:rsid w:val="00014745"/>
     <w:rPr>
       <w:rFonts w:asciiTheme="majorHAnsi" w:eastAsiaTheme="majorEastAsia" w:hAnsiTheme="majorHAnsi" w:cstheme="majorBidi"/>
-      <w:color w:val="0F4761" w:themeColor="accent1" w:themeShade="BF"/>
+      <w:color w:val="BF8F00" w:themeColor="accent1" w:themeShade="BF"/>
       <w:sz w:val="40"/>
       <w:szCs w:val="40"/>
     </w:rPr>
@@ -662,7 +1742,7 @@
     <w:rsid w:val="00014745"/>
     <w:rPr>
       <w:rFonts w:asciiTheme="majorHAnsi" w:eastAsiaTheme="majorEastAsia" w:hAnsiTheme="majorHAnsi" w:cstheme="majorBidi"/>
-      <w:color w:val="0F4761" w:themeColor="accent1" w:themeShade="BF"/>
+      <w:color w:val="BF8F00" w:themeColor="accent1" w:themeShade="BF"/>
       <w:sz w:val="32"/>
       <w:szCs w:val="32"/>
     </w:rPr>
@@ -676,7 +1756,7 @@
     <w:rsid w:val="00014745"/>
     <w:rPr>
       <w:rFonts w:eastAsiaTheme="majorEastAsia" w:cstheme="majorBidi"/>
-      <w:color w:val="0F4761" w:themeColor="accent1" w:themeShade="BF"/>
+      <w:color w:val="BF8F00" w:themeColor="accent1" w:themeShade="BF"/>
       <w:sz w:val="28"/>
       <w:szCs w:val="28"/>
     </w:rPr>
@@ -692,7 +1772,7 @@
       <w:rFonts w:eastAsiaTheme="majorEastAsia" w:cstheme="majorBidi"/>
       <w:i/>
       <w:iCs/>
-      <w:color w:val="0F4761" w:themeColor="accent1" w:themeShade="BF"/>
+      <w:color w:val="BF8F00" w:themeColor="accent1" w:themeShade="BF"/>
     </w:rPr>
   </w:style>
   <w:style w:type="character" w:customStyle="1" w:styleId="Heading5Char">
@@ -704,7 +1784,7 @@
     <w:rsid w:val="00014745"/>
     <w:rPr>
       <w:rFonts w:eastAsiaTheme="majorEastAsia" w:cstheme="majorBidi"/>
-      <w:color w:val="0F4761" w:themeColor="accent1" w:themeShade="BF"/>
+      <w:color w:val="BF8F00" w:themeColor="accent1" w:themeShade="BF"/>
     </w:rPr>
   </w:style>
   <w:style w:type="character" w:customStyle="1" w:styleId="Heading6Char">
@@ -718,7 +1798,7 @@
       <w:rFonts w:eastAsiaTheme="majorEastAsia" w:cstheme="majorBidi"/>
       <w:i/>
       <w:iCs/>
-      <w:color w:val="595959" w:themeColor="text1" w:themeTint="A6"/>
+      <w:color w:val="757575" w:themeColor="text1" w:themeTint="A6"/>
     </w:rPr>
   </w:style>
   <w:style w:type="character" w:customStyle="1" w:styleId="Heading7Char">
@@ -730,7 +1810,7 @@
     <w:rsid w:val="00014745"/>
     <w:rPr>
       <w:rFonts w:eastAsiaTheme="majorEastAsia" w:cstheme="majorBidi"/>
-      <w:color w:val="595959" w:themeColor="text1" w:themeTint="A6"/>
+      <w:color w:val="757575" w:themeColor="text1" w:themeTint="A6"/>
     </w:rPr>
   </w:style>
   <w:style w:type="character" w:customStyle="1" w:styleId="Heading8Char">
@@ -744,7 +1824,7 @@
       <w:rFonts w:eastAsiaTheme="majorEastAsia" w:cstheme="majorBidi"/>
       <w:i/>
       <w:iCs/>
-      <w:color w:val="272727" w:themeColor="text1" w:themeTint="D8"/>
+      <w:color w:val="4C4C4C" w:themeColor="text1" w:themeTint="D8"/>
     </w:rPr>
   </w:style>
   <w:style w:type="character" w:customStyle="1" w:styleId="Heading9Char">
@@ -756,7 +1836,7 @@
     <w:rsid w:val="00014745"/>
     <w:rPr>
       <w:rFonts w:eastAsiaTheme="majorEastAsia" w:cstheme="majorBidi"/>
-      <w:color w:val="272727" w:themeColor="text1" w:themeTint="D8"/>
+      <w:color w:val="4C4C4C" w:themeColor="text1" w:themeTint="D8"/>
     </w:rPr>
   </w:style>
   <w:style w:type="paragraph" w:styleId="Title">
@@ -808,7 +1888,7 @@
     </w:pPr>
     <w:rPr>
       <w:rFonts w:eastAsiaTheme="majorEastAsia" w:cstheme="majorBidi"/>
-      <w:color w:val="595959" w:themeColor="text1" w:themeTint="A6"/>
+      <w:color w:val="757575" w:themeColor="text1" w:themeTint="A6"/>
       <w:spacing w:val="15"/>
       <w:sz w:val="28"/>
       <w:szCs w:val="28"/>
@@ -822,7 +1902,7 @@
     <w:rsid w:val="00014745"/>
     <w:rPr>
       <w:rFonts w:eastAsiaTheme="majorEastAsia" w:cstheme="majorBidi"/>
-      <w:color w:val="595959" w:themeColor="text1" w:themeTint="A6"/>
+      <w:color w:val="757575" w:themeColor="text1" w:themeTint="A6"/>
       <w:spacing w:val="15"/>
       <w:sz w:val="28"/>
       <w:szCs w:val="28"/>
@@ -843,7 +1923,7 @@
     <w:rPr>
       <w:i/>
       <w:iCs/>
-      <w:color w:val="404040" w:themeColor="text1" w:themeTint="BF"/>
+      <w:color w:val="606060" w:themeColor="text1" w:themeTint="BF"/>
     </w:rPr>
   </w:style>
   <w:style w:type="character" w:customStyle="1" w:styleId="QuoteChar">
@@ -855,7 +1935,7 @@
     <w:rPr>
       <w:i/>
       <w:iCs/>
-      <w:color w:val="404040" w:themeColor="text1" w:themeTint="BF"/>
+      <w:color w:val="606060" w:themeColor="text1" w:themeTint="BF"/>
     </w:rPr>
   </w:style>
   <w:style w:type="paragraph" w:styleId="ListParagraph">
@@ -878,7 +1958,7 @@
     <w:rPr>
       <w:i/>
       <w:iCs/>
-      <w:color w:val="0F4761" w:themeColor="accent1" w:themeShade="BF"/>
+      <w:color w:val="BF8F00" w:themeColor="accent1" w:themeShade="BF"/>
     </w:rPr>
   </w:style>
   <w:style w:type="paragraph" w:styleId="IntenseQuote">
@@ -891,8 +1971,8 @@
     <w:rsid w:val="00014745"/>
     <w:pPr>
       <w:pBdr>
-        <w:top w:val="single" w:sz="4" w:space="10" w:color="0F4761" w:themeColor="accent1" w:themeShade="BF"/>
-        <w:bottom w:val="single" w:sz="4" w:space="10" w:color="0F4761" w:themeColor="accent1" w:themeShade="BF"/>
+        <w:top w:val="single" w:sz="4" w:space="10" w:color="BF8F00" w:themeColor="accent1" w:themeShade="BF"/>
+        <w:bottom w:val="single" w:sz="4" w:space="10" w:color="BF8F00" w:themeColor="accent1" w:themeShade="BF"/>
       </w:pBdr>
       <w:spacing w:before="360" w:after="360"/>
       <w:ind w:left="864" w:right="864"/>
@@ -901,7 +1981,7 @@
     <w:rPr>
       <w:i/>
       <w:iCs/>
-      <w:color w:val="0F4761" w:themeColor="accent1" w:themeShade="BF"/>
+      <w:color w:val="BF8F00" w:themeColor="accent1" w:themeShade="BF"/>
     </w:rPr>
   </w:style>
   <w:style w:type="character" w:customStyle="1" w:styleId="IntenseQuoteChar">
@@ -913,7 +1993,7 @@
     <w:rPr>
       <w:i/>
       <w:iCs/>
-      <w:color w:val="0F4761" w:themeColor="accent1" w:themeShade="BF"/>
+      <w:color w:val="BF8F00" w:themeColor="accent1" w:themeShade="BF"/>
     </w:rPr>
   </w:style>
   <w:style w:type="character" w:styleId="IntenseReference">
@@ -926,118 +2006,403 @@
       <w:b/>
       <w:bCs/>
       <w:smallCaps/>
-      <w:color w:val="0F4761" w:themeColor="accent1" w:themeShade="BF"/>
+      <w:color w:val="BF8F00" w:themeColor="accent1" w:themeShade="BF"/>
       <w:spacing w:val="5"/>
     </w:rPr>
+  </w:style>
+  <w:style w:type="table" w:styleId="TableGrid">
+    <w:name w:val="Table Grid"/>
+    <w:basedOn w:val="TableNormal"/>
+    <w:uiPriority w:val="39"/>
+    <w:rsid w:val="0016400E"/>
+    <w:pPr>
+      <w:spacing w:after="0" w:line="240" w:lineRule="auto"/>
+    </w:pPr>
+    <w:tblPr>
+      <w:tblBorders>
+        <w:top w:val="single" w:sz="4" w:space="0" w:color="auto"/>
+        <w:left w:val="single" w:sz="4" w:space="0" w:color="auto"/>
+        <w:bottom w:val="single" w:sz="4" w:space="0" w:color="auto"/>
+        <w:right w:val="single" w:sz="4" w:space="0" w:color="auto"/>
+        <w:insideH w:val="single" w:sz="4" w:space="0" w:color="auto"/>
+        <w:insideV w:val="single" w:sz="4" w:space="0" w:color="auto"/>
+      </w:tblBorders>
+    </w:tblPr>
+  </w:style>
+  <w:style w:type="table" w:styleId="GridTable3-Accent1">
+    <w:name w:val="Grid Table 3 Accent 1"/>
+    <w:basedOn w:val="TableNormal"/>
+    <w:uiPriority w:val="48"/>
+    <w:rsid w:val="0016400E"/>
+    <w:pPr>
+      <w:spacing w:after="0" w:line="240" w:lineRule="auto"/>
+    </w:pPr>
+    <w:tblPr>
+      <w:tblStyleRowBandSize w:val="1"/>
+      <w:tblStyleColBandSize w:val="1"/>
+      <w:tblBorders>
+        <w:top w:val="single" w:sz="4" w:space="0" w:color="FFD966" w:themeColor="accent1" w:themeTint="99"/>
+        <w:left w:val="single" w:sz="4" w:space="0" w:color="FFD966" w:themeColor="accent1" w:themeTint="99"/>
+        <w:bottom w:val="single" w:sz="4" w:space="0" w:color="FFD966" w:themeColor="accent1" w:themeTint="99"/>
+        <w:right w:val="single" w:sz="4" w:space="0" w:color="FFD966" w:themeColor="accent1" w:themeTint="99"/>
+        <w:insideH w:val="single" w:sz="4" w:space="0" w:color="FFD966" w:themeColor="accent1" w:themeTint="99"/>
+        <w:insideV w:val="single" w:sz="4" w:space="0" w:color="FFD966" w:themeColor="accent1" w:themeTint="99"/>
+      </w:tblBorders>
+    </w:tblPr>
+    <w:tblStylePr w:type="firstRow">
+      <w:rPr>
+        <w:b/>
+        <w:bCs/>
+      </w:rPr>
+      <w:tblPr/>
+      <w:tcPr>
+        <w:tcBorders>
+          <w:top w:val="nil"/>
+          <w:left w:val="nil"/>
+          <w:right w:val="nil"/>
+          <w:insideH w:val="nil"/>
+          <w:insideV w:val="nil"/>
+        </w:tcBorders>
+        <w:shd w:val="clear" w:color="auto" w:fill="FFFFFF" w:themeFill="background1"/>
+      </w:tcPr>
+    </w:tblStylePr>
+    <w:tblStylePr w:type="lastRow">
+      <w:rPr>
+        <w:b/>
+        <w:bCs/>
+      </w:rPr>
+      <w:tblPr/>
+      <w:tcPr>
+        <w:tcBorders>
+          <w:left w:val="nil"/>
+          <w:bottom w:val="nil"/>
+          <w:right w:val="nil"/>
+          <w:insideH w:val="nil"/>
+          <w:insideV w:val="nil"/>
+        </w:tcBorders>
+        <w:shd w:val="clear" w:color="auto" w:fill="FFFFFF" w:themeFill="background1"/>
+      </w:tcPr>
+    </w:tblStylePr>
+    <w:tblStylePr w:type="firstCol">
+      <w:pPr>
+        <w:jc w:val="right"/>
+      </w:pPr>
+      <w:rPr>
+        <w:i/>
+        <w:iCs/>
+      </w:rPr>
+      <w:tblPr/>
+      <w:tcPr>
+        <w:tcBorders>
+          <w:top w:val="nil"/>
+          <w:left w:val="nil"/>
+          <w:bottom w:val="nil"/>
+          <w:insideH w:val="nil"/>
+          <w:insideV w:val="nil"/>
+        </w:tcBorders>
+        <w:shd w:val="clear" w:color="auto" w:fill="FFFFFF" w:themeFill="background1"/>
+      </w:tcPr>
+    </w:tblStylePr>
+    <w:tblStylePr w:type="lastCol">
+      <w:rPr>
+        <w:i/>
+        <w:iCs/>
+      </w:rPr>
+      <w:tblPr/>
+      <w:tcPr>
+        <w:tcBorders>
+          <w:top w:val="nil"/>
+          <w:bottom w:val="nil"/>
+          <w:right w:val="nil"/>
+          <w:insideH w:val="nil"/>
+          <w:insideV w:val="nil"/>
+        </w:tcBorders>
+        <w:shd w:val="clear" w:color="auto" w:fill="FFFFFF" w:themeFill="background1"/>
+      </w:tcPr>
+    </w:tblStylePr>
+    <w:tblStylePr w:type="band1Vert">
+      <w:tblPr/>
+      <w:tcPr>
+        <w:shd w:val="clear" w:color="auto" w:fill="FFF2CC" w:themeFill="accent1" w:themeFillTint="33"/>
+      </w:tcPr>
+    </w:tblStylePr>
+    <w:tblStylePr w:type="band1Horz">
+      <w:tblPr/>
+      <w:tcPr>
+        <w:shd w:val="clear" w:color="auto" w:fill="FFF2CC" w:themeFill="accent1" w:themeFillTint="33"/>
+      </w:tcPr>
+    </w:tblStylePr>
+    <w:tblStylePr w:type="neCell">
+      <w:tblPr/>
+      <w:tcPr>
+        <w:tcBorders>
+          <w:bottom w:val="single" w:sz="4" w:space="0" w:color="FFD966" w:themeColor="accent1" w:themeTint="99"/>
+        </w:tcBorders>
+      </w:tcPr>
+    </w:tblStylePr>
+    <w:tblStylePr w:type="nwCell">
+      <w:tblPr/>
+      <w:tcPr>
+        <w:tcBorders>
+          <w:bottom w:val="single" w:sz="4" w:space="0" w:color="FFD966" w:themeColor="accent1" w:themeTint="99"/>
+        </w:tcBorders>
+      </w:tcPr>
+    </w:tblStylePr>
+    <w:tblStylePr w:type="seCell">
+      <w:tblPr/>
+      <w:tcPr>
+        <w:tcBorders>
+          <w:top w:val="single" w:sz="4" w:space="0" w:color="FFD966" w:themeColor="accent1" w:themeTint="99"/>
+        </w:tcBorders>
+      </w:tcPr>
+    </w:tblStylePr>
+    <w:tblStylePr w:type="swCell">
+      <w:tblPr/>
+      <w:tcPr>
+        <w:tcBorders>
+          <w:top w:val="single" w:sz="4" w:space="0" w:color="FFD966" w:themeColor="accent1" w:themeTint="99"/>
+        </w:tcBorders>
+      </w:tcPr>
+    </w:tblStylePr>
+  </w:style>
+  <w:style w:type="table" w:styleId="GridTable5Dark-Accent1">
+    <w:name w:val="Grid Table 5 Dark Accent 1"/>
+    <w:basedOn w:val="TableNormal"/>
+    <w:uiPriority w:val="50"/>
+    <w:rsid w:val="0016400E"/>
+    <w:pPr>
+      <w:spacing w:after="0" w:line="240" w:lineRule="auto"/>
+    </w:pPr>
+    <w:tblPr>
+      <w:tblStyleRowBandSize w:val="1"/>
+      <w:tblStyleColBandSize w:val="1"/>
+      <w:tblBorders>
+        <w:top w:val="single" w:sz="4" w:space="0" w:color="FFFFFF" w:themeColor="background1"/>
+        <w:left w:val="single" w:sz="4" w:space="0" w:color="FFFFFF" w:themeColor="background1"/>
+        <w:bottom w:val="single" w:sz="4" w:space="0" w:color="FFFFFF" w:themeColor="background1"/>
+        <w:right w:val="single" w:sz="4" w:space="0" w:color="FFFFFF" w:themeColor="background1"/>
+        <w:insideH w:val="single" w:sz="4" w:space="0" w:color="FFFFFF" w:themeColor="background1"/>
+        <w:insideV w:val="single" w:sz="4" w:space="0" w:color="FFFFFF" w:themeColor="background1"/>
+      </w:tblBorders>
+    </w:tblPr>
+    <w:tcPr>
+      <w:shd w:val="clear" w:color="auto" w:fill="FFF2CC" w:themeFill="accent1" w:themeFillTint="33"/>
+    </w:tcPr>
+    <w:tblStylePr w:type="firstRow">
+      <w:rPr>
+        <w:b/>
+        <w:bCs/>
+        <w:color w:val="FFFFFF" w:themeColor="background1"/>
+      </w:rPr>
+      <w:tblPr/>
+      <w:tcPr>
+        <w:tcBorders>
+          <w:top w:val="single" w:sz="4" w:space="0" w:color="FFFFFF" w:themeColor="background1"/>
+          <w:left w:val="single" w:sz="4" w:space="0" w:color="FFFFFF" w:themeColor="background1"/>
+          <w:right w:val="single" w:sz="4" w:space="0" w:color="FFFFFF" w:themeColor="background1"/>
+          <w:insideH w:val="nil"/>
+          <w:insideV w:val="nil"/>
+        </w:tcBorders>
+        <w:shd w:val="clear" w:color="auto" w:fill="FFC000" w:themeFill="accent1"/>
+      </w:tcPr>
+    </w:tblStylePr>
+    <w:tblStylePr w:type="lastRow">
+      <w:rPr>
+        <w:b/>
+        <w:bCs/>
+        <w:color w:val="FFFFFF" w:themeColor="background1"/>
+      </w:rPr>
+      <w:tblPr/>
+      <w:tcPr>
+        <w:tcBorders>
+          <w:left w:val="single" w:sz="4" w:space="0" w:color="FFFFFF" w:themeColor="background1"/>
+          <w:bottom w:val="single" w:sz="4" w:space="0" w:color="FFFFFF" w:themeColor="background1"/>
+          <w:right w:val="single" w:sz="4" w:space="0" w:color="FFFFFF" w:themeColor="background1"/>
+          <w:insideH w:val="nil"/>
+          <w:insideV w:val="nil"/>
+        </w:tcBorders>
+        <w:shd w:val="clear" w:color="auto" w:fill="FFC000" w:themeFill="accent1"/>
+      </w:tcPr>
+    </w:tblStylePr>
+    <w:tblStylePr w:type="firstCol">
+      <w:rPr>
+        <w:b/>
+        <w:bCs/>
+        <w:color w:val="FFFFFF" w:themeColor="background1"/>
+      </w:rPr>
+      <w:tblPr/>
+      <w:tcPr>
+        <w:tcBorders>
+          <w:top w:val="single" w:sz="4" w:space="0" w:color="FFFFFF" w:themeColor="background1"/>
+          <w:left w:val="single" w:sz="4" w:space="0" w:color="FFFFFF" w:themeColor="background1"/>
+          <w:bottom w:val="single" w:sz="4" w:space="0" w:color="FFFFFF" w:themeColor="background1"/>
+          <w:insideV w:val="nil"/>
+        </w:tcBorders>
+        <w:shd w:val="clear" w:color="auto" w:fill="FFC000" w:themeFill="accent1"/>
+      </w:tcPr>
+    </w:tblStylePr>
+    <w:tblStylePr w:type="lastCol">
+      <w:rPr>
+        <w:b/>
+        <w:bCs/>
+        <w:color w:val="FFFFFF" w:themeColor="background1"/>
+      </w:rPr>
+      <w:tblPr/>
+      <w:tcPr>
+        <w:tcBorders>
+          <w:top w:val="single" w:sz="4" w:space="0" w:color="FFFFFF" w:themeColor="background1"/>
+          <w:bottom w:val="single" w:sz="4" w:space="0" w:color="FFFFFF" w:themeColor="background1"/>
+          <w:right w:val="single" w:sz="4" w:space="0" w:color="FFFFFF" w:themeColor="background1"/>
+          <w:insideV w:val="nil"/>
+        </w:tcBorders>
+        <w:shd w:val="clear" w:color="auto" w:fill="FFC000" w:themeFill="accent1"/>
+      </w:tcPr>
+    </w:tblStylePr>
+    <w:tblStylePr w:type="band1Vert">
+      <w:tblPr/>
+      <w:tcPr>
+        <w:shd w:val="clear" w:color="auto" w:fill="FFE599" w:themeFill="accent1" w:themeFillTint="66"/>
+      </w:tcPr>
+    </w:tblStylePr>
+    <w:tblStylePr w:type="band1Horz">
+      <w:tblPr/>
+      <w:tcPr>
+        <w:shd w:val="clear" w:color="auto" w:fill="FFE599" w:themeFill="accent1" w:themeFillTint="66"/>
+      </w:tcPr>
+    </w:tblStylePr>
+  </w:style>
+  <w:style w:type="table" w:styleId="GridTable4-Accent1">
+    <w:name w:val="Grid Table 4 Accent 1"/>
+    <w:basedOn w:val="TableNormal"/>
+    <w:uiPriority w:val="49"/>
+    <w:rsid w:val="004D11F1"/>
+    <w:pPr>
+      <w:spacing w:after="0" w:line="240" w:lineRule="auto"/>
+    </w:pPr>
+    <w:tblPr>
+      <w:tblStyleRowBandSize w:val="1"/>
+      <w:tblStyleColBandSize w:val="1"/>
+      <w:tblBorders>
+        <w:top w:val="single" w:sz="4" w:space="0" w:color="FFD966" w:themeColor="accent1" w:themeTint="99"/>
+        <w:left w:val="single" w:sz="4" w:space="0" w:color="FFD966" w:themeColor="accent1" w:themeTint="99"/>
+        <w:bottom w:val="single" w:sz="4" w:space="0" w:color="FFD966" w:themeColor="accent1" w:themeTint="99"/>
+        <w:right w:val="single" w:sz="4" w:space="0" w:color="FFD966" w:themeColor="accent1" w:themeTint="99"/>
+        <w:insideH w:val="single" w:sz="4" w:space="0" w:color="FFD966" w:themeColor="accent1" w:themeTint="99"/>
+        <w:insideV w:val="single" w:sz="4" w:space="0" w:color="FFD966" w:themeColor="accent1" w:themeTint="99"/>
+      </w:tblBorders>
+    </w:tblPr>
+    <w:tblStylePr w:type="firstRow">
+      <w:rPr>
+        <w:b/>
+        <w:bCs/>
+        <w:color w:val="FFFFFF" w:themeColor="background1"/>
+      </w:rPr>
+      <w:tblPr/>
+      <w:tcPr>
+        <w:tcBorders>
+          <w:top w:val="single" w:sz="4" w:space="0" w:color="FFC000" w:themeColor="accent1"/>
+          <w:left w:val="single" w:sz="4" w:space="0" w:color="FFC000" w:themeColor="accent1"/>
+          <w:bottom w:val="single" w:sz="4" w:space="0" w:color="FFC000" w:themeColor="accent1"/>
+          <w:right w:val="single" w:sz="4" w:space="0" w:color="FFC000" w:themeColor="accent1"/>
+          <w:insideH w:val="nil"/>
+          <w:insideV w:val="nil"/>
+        </w:tcBorders>
+        <w:shd w:val="clear" w:color="auto" w:fill="FFC000" w:themeFill="accent1"/>
+      </w:tcPr>
+    </w:tblStylePr>
+    <w:tblStylePr w:type="lastRow">
+      <w:rPr>
+        <w:b/>
+        <w:bCs/>
+      </w:rPr>
+      <w:tblPr/>
+      <w:tcPr>
+        <w:tcBorders>
+          <w:top w:val="double" w:sz="4" w:space="0" w:color="FFC000" w:themeColor="accent1"/>
+        </w:tcBorders>
+      </w:tcPr>
+    </w:tblStylePr>
+    <w:tblStylePr w:type="firstCol">
+      <w:rPr>
+        <w:b/>
+        <w:bCs/>
+      </w:rPr>
+    </w:tblStylePr>
+    <w:tblStylePr w:type="lastCol">
+      <w:rPr>
+        <w:b/>
+        <w:bCs/>
+      </w:rPr>
+    </w:tblStylePr>
+    <w:tblStylePr w:type="band1Vert">
+      <w:tblPr/>
+      <w:tcPr>
+        <w:shd w:val="clear" w:color="auto" w:fill="FFF2CC" w:themeFill="accent1" w:themeFillTint="33"/>
+      </w:tcPr>
+    </w:tblStylePr>
+    <w:tblStylePr w:type="band1Horz">
+      <w:tblPr/>
+      <w:tcPr>
+        <w:shd w:val="clear" w:color="auto" w:fill="FFF2CC" w:themeFill="accent1" w:themeFillTint="33"/>
+      </w:tcPr>
+    </w:tblStylePr>
   </w:style>
 </w:styles>
 </file>
 
 <file path=word/theme/theme1.xml><?xml version="1.0" encoding="utf-8"?>
-<a:theme xmlns:a="http://schemas.openxmlformats.org/drawingml/2006/main" name="Office Theme">
+<a:theme xmlns:a="http://schemas.openxmlformats.org/drawingml/2006/main" name="Banded">
   <a:themeElements>
-    <a:clrScheme name="Office">
+    <a:clrScheme name="Banded">
       <a:dk1>
-        <a:sysClr val="windowText" lastClr="000000"/>
+        <a:srgbClr val="2C2C2C"/>
       </a:dk1>
       <a:lt1>
-        <a:sysClr val="window" lastClr="FFFFFF"/>
+        <a:srgbClr val="FFFFFF"/>
       </a:lt1>
       <a:dk2>
-        <a:srgbClr val="0E2841"/>
+        <a:srgbClr val="099BDD"/>
       </a:dk2>
       <a:lt2>
-        <a:srgbClr val="E8E8E8"/>
+        <a:srgbClr val="F2F2F2"/>
       </a:lt2>
       <a:accent1>
-        <a:srgbClr val="156082"/>
+        <a:srgbClr val="FFC000"/>
       </a:accent1>
       <a:accent2>
-        <a:srgbClr val="E97132"/>
+        <a:srgbClr val="A5D028"/>
       </a:accent2>
       <a:accent3>
-        <a:srgbClr val="196B24"/>
+        <a:srgbClr val="08CC78"/>
       </a:accent3>
       <a:accent4>
-        <a:srgbClr val="0F9ED5"/>
+        <a:srgbClr val="F24099"/>
       </a:accent4>
       <a:accent5>
-        <a:srgbClr val="A02B93"/>
+        <a:srgbClr val="828288"/>
       </a:accent5>
       <a:accent6>
-        <a:srgbClr val="4EA72E"/>
+        <a:srgbClr val="F56617"/>
       </a:accent6>
       <a:hlink>
-        <a:srgbClr val="467886"/>
+        <a:srgbClr val="005DBA"/>
       </a:hlink>
       <a:folHlink>
-        <a:srgbClr val="96607D"/>
+        <a:srgbClr val="6C606A"/>
       </a:folHlink>
     </a:clrScheme>
-    <a:fontScheme name="Office">
+    <a:fontScheme name="Banded">
       <a:majorFont>
-        <a:latin typeface="Aptos Display" panose="02110004020202020204"/>
+        <a:latin typeface="Corbel" panose="020B0503020204020204"/>
         <a:ea typeface=""/>
         <a:cs typeface=""/>
-        <a:font script="Jpan" typeface="游ゴシック Light"/>
+        <a:font script="Jpan" typeface="ＭＳ ゴシック"/>
         <a:font script="Hang" typeface="맑은 고딕"/>
-        <a:font script="Hans" typeface="等线 Light"/>
+        <a:font script="Hans" typeface="宋体"/>
         <a:font script="Hant" typeface="新細明體"/>
-        <a:font script="Arab" typeface="Times New Roman"/>
-        <a:font script="Hebr" typeface="Times New Roman"/>
-        <a:font script="Thai" typeface="Angsana New"/>
-        <a:font script="Ethi" typeface="Nyala"/>
-        <a:font script="Beng" typeface="Vrinda"/>
-        <a:font script="Gujr" typeface="Shruti"/>
-        <a:font script="Khmr" typeface="MoolBoran"/>
-        <a:font script="Knda" typeface="Tunga"/>
-        <a:font script="Guru" typeface="Raavi"/>
-        <a:font script="Cans" typeface="Euphemia"/>
-        <a:font script="Cher" typeface="Plantagenet Cherokee"/>
-        <a:font script="Yiii" typeface="Microsoft Yi Baiti"/>
-        <a:font script="Tibt" typeface="Microsoft Himalaya"/>
-        <a:font script="Thaa" typeface="MV Boli"/>
-        <a:font script="Deva" typeface="Mangal"/>
-        <a:font script="Telu" typeface="Gautami"/>
-        <a:font script="Taml" typeface="Latha"/>
-        <a:font script="Syrc" typeface="Estrangelo Edessa"/>
-        <a:font script="Orya" typeface="Kalinga"/>
-        <a:font script="Mlym" typeface="Kartika"/>
-        <a:font script="Laoo" typeface="DokChampa"/>
-        <a:font script="Sinh" typeface="Iskoola Pota"/>
-        <a:font script="Mong" typeface="Mongolian Baiti"/>
-        <a:font script="Viet" typeface="Times New Roman"/>
-        <a:font script="Uigh" typeface="Microsoft Uighur"/>
-        <a:font script="Geor" typeface="Sylfaen"/>
-        <a:font script="Armn" typeface="Arial"/>
-        <a:font script="Bugi" typeface="Leelawadee UI"/>
-        <a:font script="Bopo" typeface="Microsoft JhengHei"/>
-        <a:font script="Java" typeface="Javanese Text"/>
-        <a:font script="Lisu" typeface="Segoe UI"/>
-        <a:font script="Mymr" typeface="Myanmar Text"/>
-        <a:font script="Nkoo" typeface="Ebrima"/>
-        <a:font script="Olck" typeface="Nirmala UI"/>
-        <a:font script="Osma" typeface="Ebrima"/>
-        <a:font script="Phag" typeface="Phagspa"/>
-        <a:font script="Syrn" typeface="Estrangelo Edessa"/>
-        <a:font script="Syrj" typeface="Estrangelo Edessa"/>
-        <a:font script="Syre" typeface="Estrangelo Edessa"/>
-        <a:font script="Sora" typeface="Nirmala UI"/>
-        <a:font script="Tale" typeface="Microsoft Tai Le"/>
-        <a:font script="Talu" typeface="Microsoft New Tai Lue"/>
-        <a:font script="Tfng" typeface="Ebrima"/>
-      </a:majorFont>
-      <a:minorFont>
-        <a:latin typeface="Aptos" panose="02110004020202020204"/>
-        <a:ea typeface=""/>
-        <a:cs typeface=""/>
-        <a:font script="Jpan" typeface="游明朝"/>
-        <a:font script="Hang" typeface="맑은 고딕"/>
-        <a:font script="Hans" typeface="等线"/>
-        <a:font script="Hant" typeface="新細明體"/>
-        <a:font script="Arab" typeface="Arial"/>
-        <a:font script="Hebr" typeface="Arial"/>
-        <a:font script="Thai" typeface="Cordia New"/>
+        <a:font script="Arab" typeface="Tahoma"/>
+        <a:font script="Hebr" typeface="Gisha"/>
+        <a:font script="Thai" typeface="DilleniaUPC"/>
         <a:font script="Ethi" typeface="Nyala"/>
         <a:font script="Beng" typeface="Vrinda"/>
         <a:font script="Gujr" typeface="Shruti"/>
@@ -1058,29 +2423,47 @@
         <a:font script="Laoo" typeface="DokChampa"/>
         <a:font script="Sinh" typeface="Iskoola Pota"/>
         <a:font script="Mong" typeface="Mongolian Baiti"/>
-        <a:font script="Viet" typeface="Arial"/>
+        <a:font script="Viet" typeface="Tahoma"/>
         <a:font script="Uigh" typeface="Microsoft Uighur"/>
         <a:font script="Geor" typeface="Sylfaen"/>
-        <a:font script="Armn" typeface="Arial"/>
-        <a:font script="Bugi" typeface="Leelawadee UI"/>
-        <a:font script="Bopo" typeface="Microsoft JhengHei"/>
-        <a:font script="Java" typeface="Javanese Text"/>
-        <a:font script="Lisu" typeface="Segoe UI"/>
-        <a:font script="Mymr" typeface="Myanmar Text"/>
-        <a:font script="Nkoo" typeface="Ebrima"/>
-        <a:font script="Olck" typeface="Nirmala UI"/>
-        <a:font script="Osma" typeface="Ebrima"/>
-        <a:font script="Phag" typeface="Phagspa"/>
-        <a:font script="Syrn" typeface="Estrangelo Edessa"/>
-        <a:font script="Syrj" typeface="Estrangelo Edessa"/>
-        <a:font script="Syre" typeface="Estrangelo Edessa"/>
-        <a:font script="Sora" typeface="Nirmala UI"/>
-        <a:font script="Tale" typeface="Microsoft Tai Le"/>
-        <a:font script="Talu" typeface="Microsoft New Tai Lue"/>
-        <a:font script="Tfng" typeface="Ebrima"/>
+      </a:majorFont>
+      <a:minorFont>
+        <a:latin typeface="Corbel" panose="020B0503020204020204"/>
+        <a:ea typeface=""/>
+        <a:cs typeface=""/>
+        <a:font script="Jpan" typeface="ＭＳ ゴシック"/>
+        <a:font script="Hang" typeface="맑은 고딕"/>
+        <a:font script="Hans" typeface="宋体"/>
+        <a:font script="Hant" typeface="新細明體"/>
+        <a:font script="Arab" typeface="Tahoma"/>
+        <a:font script="Hebr" typeface="Gisha"/>
+        <a:font script="Thai" typeface="DilleniaUPC"/>
+        <a:font script="Ethi" typeface="Nyala"/>
+        <a:font script="Beng" typeface="Vrinda"/>
+        <a:font script="Gujr" typeface="Shruti"/>
+        <a:font script="Khmr" typeface="DaunPenh"/>
+        <a:font script="Knda" typeface="Tunga"/>
+        <a:font script="Guru" typeface="Raavi"/>
+        <a:font script="Cans" typeface="Euphemia"/>
+        <a:font script="Cher" typeface="Plantagenet Cherokee"/>
+        <a:font script="Yiii" typeface="Microsoft Yi Baiti"/>
+        <a:font script="Tibt" typeface="Microsoft Himalaya"/>
+        <a:font script="Thaa" typeface="MV Boli"/>
+        <a:font script="Deva" typeface="Mangal"/>
+        <a:font script="Telu" typeface="Gautami"/>
+        <a:font script="Taml" typeface="Latha"/>
+        <a:font script="Syrc" typeface="Estrangelo Edessa"/>
+        <a:font script="Orya" typeface="Kalinga"/>
+        <a:font script="Mlym" typeface="Kartika"/>
+        <a:font script="Laoo" typeface="DokChampa"/>
+        <a:font script="Sinh" typeface="Iskoola Pota"/>
+        <a:font script="Mong" typeface="Mongolian Baiti"/>
+        <a:font script="Viet" typeface="Verdana"/>
+        <a:font script="Uigh" typeface="Microsoft Uighur"/>
+        <a:font script="Geor" typeface="Sylfaen"/>
       </a:minorFont>
     </a:fontScheme>
-    <a:fmtScheme name="Office">
+    <a:fmtScheme name="Banded">
       <a:fillStyleLst>
         <a:solidFill>
           <a:schemeClr val="phClr"/>
@@ -1089,23 +2472,23 @@
           <a:gsLst>
             <a:gs pos="0">
               <a:schemeClr val="phClr">
-                <a:lumMod val="110000"/>
-                <a:satMod val="105000"/>
-                <a:tint val="67000"/>
+                <a:tint val="65000"/>
+                <a:satMod val="120000"/>
+                <a:lumMod val="107000"/>
               </a:schemeClr>
             </a:gs>
             <a:gs pos="50000">
               <a:schemeClr val="phClr">
-                <a:lumMod val="105000"/>
-                <a:satMod val="103000"/>
-                <a:tint val="73000"/>
+                <a:tint val="70000"/>
+                <a:satMod val="124000"/>
+                <a:lumMod val="103000"/>
               </a:schemeClr>
             </a:gs>
             <a:gs pos="100000">
               <a:schemeClr val="phClr">
-                <a:lumMod val="105000"/>
-                <a:satMod val="109000"/>
-                <a:tint val="81000"/>
+                <a:tint val="85000"/>
+                <a:satMod val="120000"/>
+                <a:lumMod val="100000"/>
               </a:schemeClr>
             </a:gs>
           </a:gsLst>
@@ -1115,23 +2498,24 @@
           <a:gsLst>
             <a:gs pos="0">
               <a:schemeClr val="phClr">
-                <a:satMod val="103000"/>
-                <a:lumMod val="102000"/>
-                <a:tint val="94000"/>
+                <a:tint val="85000"/>
+                <a:shade val="98000"/>
+                <a:satMod val="110000"/>
+                <a:lumMod val="103000"/>
               </a:schemeClr>
             </a:gs>
             <a:gs pos="50000">
               <a:schemeClr val="phClr">
-                <a:satMod val="110000"/>
+                <a:shade val="85000"/>
+                <a:satMod val="105000"/>
                 <a:lumMod val="100000"/>
-                <a:shade val="100000"/>
               </a:schemeClr>
             </a:gs>
             <a:gs pos="100000">
               <a:schemeClr val="phClr">
-                <a:lumMod val="99000"/>
+                <a:shade val="60000"/>
                 <a:satMod val="120000"/>
-                <a:shade val="78000"/>
+                <a:lumMod val="100000"/>
               </a:schemeClr>
             </a:gs>
           </a:gsLst>
@@ -1139,26 +2523,23 @@
         </a:gradFill>
       </a:fillStyleLst>
       <a:lnStyleLst>
+        <a:ln w="9525" cap="flat" cmpd="sng" algn="ctr">
+          <a:solidFill>
+            <a:schemeClr val="phClr"/>
+          </a:solidFill>
+          <a:prstDash val="solid"/>
+        </a:ln>
         <a:ln w="12700" cap="flat" cmpd="sng" algn="ctr">
           <a:solidFill>
             <a:schemeClr val="phClr"/>
           </a:solidFill>
           <a:prstDash val="solid"/>
-          <a:miter lim="800000"/>
-        </a:ln>
-        <a:ln w="19050" cap="flat" cmpd="sng" algn="ctr">
-          <a:solidFill>
-            <a:schemeClr val="phClr"/>
-          </a:solidFill>
-          <a:prstDash val="solid"/>
-          <a:miter lim="800000"/>
         </a:ln>
         <a:ln w="25400" cap="flat" cmpd="sng" algn="ctr">
           <a:solidFill>
             <a:schemeClr val="phClr"/>
           </a:solidFill>
           <a:prstDash val="solid"/>
-          <a:miter lim="800000"/>
         </a:ln>
       </a:lnStyleLst>
       <a:effectStyleLst>
@@ -1166,11 +2547,17 @@
           <a:effectLst/>
         </a:effectStyle>
         <a:effectStyle>
-          <a:effectLst/>
+          <a:effectLst>
+            <a:outerShdw blurRad="50800" dist="15875" dir="5400000" algn="ctr" rotWithShape="0">
+              <a:srgbClr val="000000">
+                <a:alpha val="68000"/>
+              </a:srgbClr>
+            </a:outerShdw>
+          </a:effectLst>
         </a:effectStyle>
         <a:effectStyle>
           <a:effectLst>
-            <a:outerShdw blurRad="57150" dist="19050" dir="5400000" algn="ctr" rotWithShape="0">
+            <a:outerShdw blurRad="88900" dist="27940" dir="5400000" algn="ctr" rotWithShape="0">
               <a:srgbClr val="000000">
                 <a:alpha val="63000"/>
               </a:srgbClr>
@@ -1182,34 +2569,31 @@
         <a:solidFill>
           <a:schemeClr val="phClr"/>
         </a:solidFill>
-        <a:solidFill>
-          <a:schemeClr val="phClr">
-            <a:tint val="95000"/>
-            <a:satMod val="170000"/>
-          </a:schemeClr>
-        </a:solidFill>
+        <a:blipFill rotWithShape="1">
+          <a:blip xmlns:r="http://schemas.openxmlformats.org/officeDocument/2006/relationships" r:embed="rId1">
+            <a:duotone>
+              <a:schemeClr val="phClr"/>
+              <a:schemeClr val="phClr">
+                <a:shade val="91000"/>
+                <a:satMod val="105000"/>
+              </a:schemeClr>
+            </a:duotone>
+          </a:blip>
+          <a:tile tx="0" ty="0" sx="100000" sy="100000" flip="none" algn="tl"/>
+        </a:blipFill>
         <a:gradFill rotWithShape="1">
           <a:gsLst>
             <a:gs pos="0">
               <a:schemeClr val="phClr">
-                <a:tint val="93000"/>
-                <a:satMod val="150000"/>
-                <a:shade val="98000"/>
-                <a:lumMod val="102000"/>
-              </a:schemeClr>
-            </a:gs>
-            <a:gs pos="50000">
-              <a:schemeClr val="phClr">
-                <a:tint val="98000"/>
-                <a:satMod val="130000"/>
-                <a:shade val="90000"/>
-                <a:lumMod val="103000"/>
+                <a:tint val="100000"/>
+                <a:shade val="0"/>
+                <a:satMod val="100000"/>
               </a:schemeClr>
             </a:gs>
             <a:gs pos="100000">
               <a:schemeClr val="phClr">
-                <a:shade val="63000"/>
-                <a:satMod val="120000"/>
+                <a:shade val="100000"/>
+                <a:satMod val="100000"/>
               </a:schemeClr>
             </a:gs>
           </a:gsLst>
@@ -1218,37 +2602,34 @@
       </a:bgFillStyleLst>
     </a:fmtScheme>
   </a:themeElements>
-  <a:objectDefaults>
-    <a:lnDef>
-      <a:spPr/>
-      <a:bodyPr/>
-      <a:lstStyle/>
-      <a:style>
-        <a:lnRef idx="2">
-          <a:schemeClr val="accent1"/>
-        </a:lnRef>
-        <a:fillRef idx="0">
-          <a:schemeClr val="accent1"/>
-        </a:fillRef>
-        <a:effectRef idx="1">
-          <a:schemeClr val="accent1"/>
-        </a:effectRef>
-        <a:fontRef idx="minor">
-          <a:schemeClr val="tx1"/>
-        </a:fontRef>
-      </a:style>
-    </a:lnDef>
-  </a:objectDefaults>
+  <a:objectDefaults/>
   <a:extraClrSchemeLst/>
   <a:extLst>
     <a:ext uri="{05A4C25C-085E-4340-85A3-A5531E510DB2}">
-      <thm15:themeFamily xmlns:thm15="http://schemas.microsoft.com/office/thememl/2012/main" name="Office Theme" id="{2E142A2C-CD16-42D6-873A-C26D2A0506FA}" vid="{1BDDFF52-6CD6-40A5-AB3C-68EB2F1E4D0A}"/>
+      <thm15:themeFamily xmlns:thm15="http://schemas.microsoft.com/office/thememl/2012/main" name="Banded" id="{98DFF888-2449-4D28-977C-6306C017633E}" vid="{9792607F-9579-4224-82FF-9C88C3E1E53D}"/>
     </a:ext>
   </a:extLst>
 </a:theme>
 </file>
 
 <file path=customXml/item1.xml><?xml version="1.0" encoding="utf-8"?>
+<p:properties xmlns:p="http://schemas.microsoft.com/office/2006/metadata/properties" xmlns:xsi="http://www.w3.org/2001/XMLSchema-instance" xmlns:pc="http://schemas.microsoft.com/office/infopath/2007/PartnerControls">
+  <documentManagement>
+    <_activity xmlns="6d9cd9d4-7f95-4030-99e8-22f49a492b9b" xsi:nil="true"/>
+  </documentManagement>
+</p:properties>
+</file>
+
+<file path=customXml/item2.xml><?xml version="1.0" encoding="utf-8"?>
+<?mso-contentType ?>
+<FormTemplates xmlns="http://schemas.microsoft.com/sharepoint/v3/contenttype/forms">
+  <Display>DocumentLibraryForm</Display>
+  <Edit>DocumentLibraryForm</Edit>
+  <New>DocumentLibraryForm</New>
+</FormTemplates>
+</file>
+
+<file path=customXml/item3.xml><?xml version="1.0" encoding="utf-8"?>
 <ct:contentTypeSchema xmlns:ct="http://schemas.microsoft.com/office/2006/metadata/contentType" xmlns:ma="http://schemas.microsoft.com/office/2006/metadata/properties/metaAttributes" ct:_="" ma:_="" ma:contentTypeName="Document" ma:contentTypeID="0x010100BB7B4EEA93749F47ACC67C59D6CA994E" ma:contentTypeVersion="10" ma:contentTypeDescription="Create a new document." ma:contentTypeScope="" ma:versionID="4b2bc57da4ecd394b67d6d28d09c49c4">
   <xsd:schema xmlns:xsd="http://www.w3.org/2001/XMLSchema" xmlns:xs="http://www.w3.org/2001/XMLSchema" xmlns:p="http://schemas.microsoft.com/office/2006/metadata/properties" xmlns:ns3="6d9cd9d4-7f95-4030-99e8-22f49a492b9b" targetNamespace="http://schemas.microsoft.com/office/2006/metadata/properties" ma:root="true" ma:fieldsID="3e06cec664627388864568ba523444e1" ns3:_="">
     <xsd:import namespace="6d9cd9d4-7f95-4030-99e8-22f49a492b9b"/>
@@ -1430,24 +2811,25 @@
 </ct:contentTypeSchema>
 </file>
 
-<file path=customXml/item2.xml><?xml version="1.0" encoding="utf-8"?>
-<?mso-contentType ?>
-<FormTemplates xmlns="http://schemas.microsoft.com/sharepoint/v3/contenttype/forms">
-  <Display>DocumentLibraryForm</Display>
-  <Edit>DocumentLibraryForm</Edit>
-  <New>DocumentLibraryForm</New>
-</FormTemplates>
+<file path=customXml/itemProps1.xml><?xml version="1.0" encoding="utf-8"?>
+<ds:datastoreItem xmlns:ds="http://schemas.openxmlformats.org/officeDocument/2006/customXml" ds:itemID="{43147424-35A8-4C98-A708-0F3C600D7903}">
+  <ds:schemaRefs>
+    <ds:schemaRef ds:uri="http://schemas.microsoft.com/office/2006/metadata/properties"/>
+    <ds:schemaRef ds:uri="http://schemas.microsoft.com/office/infopath/2007/PartnerControls"/>
+    <ds:schemaRef ds:uri="6d9cd9d4-7f95-4030-99e8-22f49a492b9b"/>
+  </ds:schemaRefs>
+</ds:datastoreItem>
 </file>
 
-<file path=customXml/item3.xml><?xml version="1.0" encoding="utf-8"?>
-<p:properties xmlns:p="http://schemas.microsoft.com/office/2006/metadata/properties" xmlns:xsi="http://www.w3.org/2001/XMLSchema-instance" xmlns:pc="http://schemas.microsoft.com/office/infopath/2007/PartnerControls">
-  <documentManagement>
-    <_activity xmlns="6d9cd9d4-7f95-4030-99e8-22f49a492b9b" xsi:nil="true"/>
-  </documentManagement>
-</p:properties>
+<file path=customXml/itemProps2.xml><?xml version="1.0" encoding="utf-8"?>
+<ds:datastoreItem xmlns:ds="http://schemas.openxmlformats.org/officeDocument/2006/customXml" ds:itemID="{1D4830E6-496F-41EE-BEC6-E7FF61DA2976}">
+  <ds:schemaRefs>
+    <ds:schemaRef ds:uri="http://schemas.microsoft.com/sharepoint/v3/contenttype/forms"/>
+  </ds:schemaRefs>
+</ds:datastoreItem>
 </file>
 
-<file path=customXml/itemProps1.xml><?xml version="1.0" encoding="utf-8"?>
+<file path=customXml/itemProps3.xml><?xml version="1.0" encoding="utf-8"?>
 <ds:datastoreItem xmlns:ds="http://schemas.openxmlformats.org/officeDocument/2006/customXml" ds:itemID="{D7EA9B67-124F-4FEE-8DFA-775F8AC7371F}">
   <ds:schemaRefs>
     <ds:schemaRef ds:uri="http://schemas.microsoft.com/office/2006/metadata/contentType"/>
@@ -1463,22 +2845,4 @@
     <ds:schemaRef ds:uri="http://schemas.microsoft.com/internal/obd"/>
   </ds:schemaRefs>
 </ds:datastoreItem>
-</file>
-
-<file path=customXml/itemProps2.xml><?xml version="1.0" encoding="utf-8"?>
-<ds:datastoreItem xmlns:ds="http://schemas.openxmlformats.org/officeDocument/2006/customXml" ds:itemID="{1D4830E6-496F-41EE-BEC6-E7FF61DA2976}">
-  <ds:schemaRefs>
-    <ds:schemaRef ds:uri="http://schemas.microsoft.com/sharepoint/v3/contenttype/forms"/>
-  </ds:schemaRefs>
-</ds:datastoreItem>
-</file>
-
-<file path=customXml/itemProps3.xml><?xml version="1.0" encoding="utf-8"?>
-<ds:datastoreItem xmlns:ds="http://schemas.openxmlformats.org/officeDocument/2006/customXml" ds:itemID="{43147424-35A8-4C98-A708-0F3C600D7903}">
-  <ds:schemaRefs>
-    <ds:schemaRef ds:uri="http://schemas.microsoft.com/office/2006/metadata/properties"/>
-    <ds:schemaRef ds:uri="http://schemas.microsoft.com/office/infopath/2007/PartnerControls"/>
-    <ds:schemaRef ds:uri="6d9cd9d4-7f95-4030-99e8-22f49a492b9b"/>
-  </ds:schemaRefs>
-</ds:datastoreItem>
 </file>
</xml_diff>